<commit_message>
Task 3 fixed (docx updated)
</commit_message>
<xml_diff>
--- a/Task3/Introduction_to_DWH_and_ETL_Business_Template.docx
+++ b/Task3/Introduction_to_DWH_and_ETL_Business_Template.docx
@@ -1312,15 +1312,7 @@
         <w:t>Balaji Fast Food Sales</w:t>
       </w:r>
       <w:r>
-        <w:t xml:space="preserve"> specializes in serving a variety of high-quality </w:t>
-      </w:r>
-      <w:proofErr w:type="gramStart"/>
-      <w:r>
-        <w:t>fast food</w:t>
-      </w:r>
-      <w:proofErr w:type="gramEnd"/>
-      <w:r>
-        <w:t xml:space="preserve"> items that cater to diverse tastes and preferences. In this competitive market, success depends on understanding customer preferences, sales trends, and operational efficiency. To excel, it is crucial to systematically gather and analyze data on sales, customer behavior, and product performance.</w:t>
+        <w:t xml:space="preserve"> specializes in serving a variety of high-quality fast food items that cater to diverse tastes and preferences. In this competitive market, success depends on understanding customer preferences, sales trends, and operational efficiency. To excel, it is crucial to systematically gather and analyze data on sales, customer behavior, and product performance.</w:t>
       </w:r>
     </w:p>
     <w:p>
@@ -1420,15 +1412,7 @@
         </w:numPr>
       </w:pPr>
       <w:r>
-        <w:t xml:space="preserve">Lack of </w:t>
-      </w:r>
-      <w:proofErr w:type="gramStart"/>
-      <w:r>
-        <w:t>insights</w:t>
-      </w:r>
-      <w:proofErr w:type="gramEnd"/>
-      <w:r>
-        <w:t xml:space="preserve"> into customer buying patterns, hampering marketing efforts.</w:t>
+        <w:t>Lack of insights into customer buying patterns, hampering marketing efforts.</w:t>
       </w:r>
     </w:p>
     <w:p>
@@ -1649,15 +1633,7 @@
         <w:t xml:space="preserve"> contains the following entities and their attributes, with additional details</w:t>
       </w:r>
       <w:r>
-        <w:t xml:space="preserve"> </w:t>
-      </w:r>
-      <w:proofErr w:type="spellStart"/>
-      <w:r>
-        <w:t>witr</w:t>
-      </w:r>
-      <w:proofErr w:type="spellEnd"/>
-      <w:r>
-        <w:t xml:space="preserve"> card Payments</w:t>
+        <w:t xml:space="preserve"> witr card Payments</w:t>
       </w:r>
       <w:r>
         <w:t>:</w:t>
@@ -1667,13 +1643,8 @@
       <w:pPr>
         <w:pStyle w:val="Subtitle"/>
       </w:pPr>
-      <w:proofErr w:type="spellStart"/>
-      <w:r>
-        <w:t>Fastfood</w:t>
-      </w:r>
-      <w:proofErr w:type="spellEnd"/>
-      <w:r>
-        <w:t xml:space="preserve"> Point </w:t>
+      <w:r>
+        <w:t xml:space="preserve">Fastfood Point </w:t>
       </w:r>
       <w:r>
         <w:t>(Future dimension)</w:t>
@@ -1699,15 +1670,7 @@
         <w:t>Point Name:</w:t>
       </w:r>
       <w:r>
-        <w:t xml:space="preserve"> The name of the </w:t>
-      </w:r>
-      <w:proofErr w:type="gramStart"/>
-      <w:r>
-        <w:t>fast food</w:t>
-      </w:r>
-      <w:proofErr w:type="gramEnd"/>
-      <w:r>
-        <w:t xml:space="preserve"> outlet (e.g., Balaji_1, Balaji_2).</w:t>
+        <w:t xml:space="preserve"> The name of the fast food outlet (e.g., Balaji_1, Balaji_2).</w:t>
       </w:r>
     </w:p>
     <w:p>
@@ -1759,15 +1722,7 @@
         <w:t>Address:</w:t>
       </w:r>
       <w:r>
-        <w:t xml:space="preserve"> The exact address of the outlet (e.g., </w:t>
-      </w:r>
-      <w:proofErr w:type="spellStart"/>
-      <w:r>
-        <w:t>Satpaeva</w:t>
-      </w:r>
-      <w:proofErr w:type="spellEnd"/>
-      <w:r>
-        <w:t xml:space="preserve"> 127, Abay 99).</w:t>
+        <w:t xml:space="preserve"> The exact address of the outlet (e.g., Satpaeva 127, Abay 99).</w:t>
       </w:r>
     </w:p>
     <w:p>
@@ -1856,71 +1811,13 @@
         <w:tab/>
       </w:r>
       <w:r>
-        <w:t>Country (</w:t>
-      </w:r>
-      <w:proofErr w:type="spellStart"/>
-      <w:r>
-        <w:t>Country_ID</w:t>
-      </w:r>
-      <w:proofErr w:type="spellEnd"/>
-      <w:r>
-        <w:t xml:space="preserve">, </w:t>
-      </w:r>
-      <w:proofErr w:type="spellStart"/>
-      <w:r>
-        <w:t>country_name</w:t>
-      </w:r>
-      <w:proofErr w:type="spellEnd"/>
-      <w:r>
-        <w:t>)-&gt;</w:t>
-      </w:r>
-      <w:proofErr w:type="gramStart"/>
-      <w:r>
-        <w:t>City(</w:t>
-      </w:r>
-      <w:proofErr w:type="spellStart"/>
-      <w:proofErr w:type="gramEnd"/>
-      <w:r>
-        <w:t>City_ID</w:t>
-      </w:r>
-      <w:proofErr w:type="spellEnd"/>
-      <w:r>
-        <w:t xml:space="preserve">, </w:t>
-      </w:r>
-      <w:proofErr w:type="spellStart"/>
+        <w:t xml:space="preserve">Country (Country_ID, country_name)-&gt;City(City_ID, </w:t>
+      </w:r>
       <w:r>
         <w:t>C</w:t>
       </w:r>
       <w:r>
-        <w:t>ity_name</w:t>
-      </w:r>
-      <w:proofErr w:type="spellEnd"/>
-      <w:r>
-        <w:t xml:space="preserve">, </w:t>
-      </w:r>
-      <w:proofErr w:type="spellStart"/>
-      <w:r>
-        <w:t>Country_ID</w:t>
-      </w:r>
-      <w:proofErr w:type="spellEnd"/>
-      <w:r>
-        <w:t>(FK))-&gt;Fast food point (</w:t>
-      </w:r>
-      <w:proofErr w:type="spellStart"/>
-      <w:r>
-        <w:t>Point_ID</w:t>
-      </w:r>
-      <w:proofErr w:type="spellEnd"/>
-      <w:r>
-        <w:t xml:space="preserve">, Address, </w:t>
-      </w:r>
-      <w:proofErr w:type="spellStart"/>
-      <w:r>
-        <w:t>City_ID</w:t>
-      </w:r>
-      <w:proofErr w:type="spellEnd"/>
-      <w:r>
-        <w:t>(FK)</w:t>
+        <w:t>ity_name, Country_ID(FK))-&gt;Fast food point (Point_ID, Address, City_ID(FK)</w:t>
       </w:r>
       <w:r>
         <w:t>)</w:t>
@@ -2035,34 +1932,26 @@
       </w:pPr>
       <w:r>
         <w:tab/>
-      </w:r>
-      <w:proofErr w:type="spellStart"/>
-      <w:r>
         <w:t>Cust_id</w:t>
       </w:r>
-      <w:proofErr w:type="spellEnd"/>
     </w:p>
     <w:p>
       <w:pPr>
         <w:pStyle w:val="BodyText"/>
         <w:ind w:left="720" w:firstLine="720"/>
       </w:pPr>
-      <w:proofErr w:type="spellStart"/>
       <w:r>
         <w:t>First_name</w:t>
       </w:r>
-      <w:proofErr w:type="spellEnd"/>
     </w:p>
     <w:p>
       <w:pPr>
         <w:pStyle w:val="BodyText"/>
         <w:ind w:left="720" w:firstLine="720"/>
       </w:pPr>
-      <w:proofErr w:type="spellStart"/>
       <w:r>
         <w:t>Last_name</w:t>
       </w:r>
-      <w:proofErr w:type="spellEnd"/>
       <w:r>
         <w:br/>
       </w:r>
@@ -2161,12 +2050,8 @@
       </w:pPr>
       <w:r>
         <w:tab/>
-      </w:r>
-      <w:proofErr w:type="spellStart"/>
-      <w:r>
         <w:t>Discount_ID</w:t>
       </w:r>
-      <w:proofErr w:type="spellEnd"/>
     </w:p>
     <w:p>
       <w:pPr>
@@ -2175,12 +2060,8 @@
       </w:pPr>
       <w:r>
         <w:tab/>
-      </w:r>
-      <w:proofErr w:type="spellStart"/>
-      <w:r>
         <w:t>Date_of_discount</w:t>
       </w:r>
-      <w:proofErr w:type="spellEnd"/>
     </w:p>
     <w:p>
       <w:pPr>
@@ -2235,23 +2116,7 @@
         <w:t xml:space="preserve"> Name:</w:t>
       </w:r>
       <w:r>
-        <w:t xml:space="preserve"> The name of the product sold (e.g., </w:t>
-      </w:r>
-      <w:proofErr w:type="spellStart"/>
-      <w:r>
-        <w:t>Aalopuri</w:t>
-      </w:r>
-      <w:proofErr w:type="spellEnd"/>
-      <w:r>
-        <w:t xml:space="preserve">, </w:t>
-      </w:r>
-      <w:proofErr w:type="spellStart"/>
-      <w:r>
-        <w:t>Panipuri</w:t>
-      </w:r>
-      <w:proofErr w:type="spellEnd"/>
-      <w:r>
-        <w:t>, Cold Coffee).</w:t>
+        <w:t xml:space="preserve"> The name of the product sold (e.g., Aalopuri, Panipuri, Cold Coffee).</w:t>
       </w:r>
     </w:p>
     <w:p>
@@ -2279,7 +2144,6 @@
       <w:r>
         <w:t xml:space="preserve"> The category of the product, either </w:t>
       </w:r>
-      <w:proofErr w:type="spellStart"/>
       <w:r>
         <w:rPr>
           <w:i/>
@@ -2287,7 +2151,6 @@
         </w:rPr>
         <w:t>Fastfood</w:t>
       </w:r>
-      <w:proofErr w:type="spellEnd"/>
       <w:r>
         <w:t xml:space="preserve"> or </w:t>
       </w:r>
@@ -2330,13 +2193,6 @@
           <w:bCs/>
         </w:rPr>
         <w:tab/>
-      </w:r>
-      <w:proofErr w:type="gramStart"/>
-      <w:r>
-        <w:rPr>
-          <w:b/>
-          <w:bCs/>
-        </w:rPr>
         <w:t>Category</w:t>
       </w:r>
       <w:r>
@@ -2352,15 +2208,7 @@
           <w:bCs/>
         </w:rPr>
         <w:tab/>
-        <w:t>-</w:t>
-      </w:r>
-      <w:proofErr w:type="gramEnd"/>
-      <w:r>
-        <w:rPr>
-          <w:b/>
-          <w:bCs/>
-        </w:rPr>
-        <w:t>&gt;</w:t>
+        <w:t>-&gt;</w:t>
       </w:r>
       <w:r>
         <w:rPr>
@@ -2376,11 +2224,9 @@
         <w:pStyle w:val="BodyText"/>
         <w:ind w:left="720" w:firstLine="720"/>
       </w:pPr>
-      <w:proofErr w:type="spellStart"/>
       <w:r>
         <w:t>Category_ID</w:t>
       </w:r>
-      <w:proofErr w:type="spellEnd"/>
       <w:r>
         <w:tab/>
       </w:r>
@@ -2399,12 +2245,8 @@
       </w:pPr>
       <w:r>
         <w:tab/>
-      </w:r>
-      <w:proofErr w:type="spellStart"/>
-      <w:r>
         <w:t>Category_name</w:t>
       </w:r>
-      <w:proofErr w:type="spellEnd"/>
       <w:r>
         <w:tab/>
       </w:r>
@@ -2413,12 +2255,8 @@
       </w:r>
       <w:r>
         <w:tab/>
-      </w:r>
-      <w:proofErr w:type="spellStart"/>
-      <w:r>
         <w:t>Prod_name</w:t>
       </w:r>
-      <w:proofErr w:type="spellEnd"/>
     </w:p>
     <w:p>
       <w:pPr>
@@ -2439,14 +2277,7 @@
       </w:r>
       <w:r>
         <w:tab/>
-      </w:r>
-      <w:proofErr w:type="spellStart"/>
-      <w:r>
-        <w:t>Category_ID</w:t>
-      </w:r>
-      <w:proofErr w:type="spellEnd"/>
-      <w:r>
-        <w:t xml:space="preserve"> (FK)</w:t>
+        <w:t>Category_ID (FK)</w:t>
       </w:r>
     </w:p>
     <w:p>
@@ -2468,12 +2299,8 @@
       </w:r>
       <w:r>
         <w:tab/>
-      </w:r>
-      <w:proofErr w:type="spellStart"/>
-      <w:r>
         <w:t>Prod_price</w:t>
       </w:r>
-      <w:proofErr w:type="spellEnd"/>
     </w:p>
     <w:p>
       <w:pPr>
@@ -2551,12 +2378,8 @@
       </w:pPr>
       <w:r>
         <w:tab/>
-      </w:r>
-      <w:proofErr w:type="spellStart"/>
-      <w:r>
         <w:t>Day_of_week</w:t>
       </w:r>
-      <w:proofErr w:type="spellEnd"/>
     </w:p>
     <w:p>
       <w:pPr>
@@ -2664,12 +2487,8 @@
       </w:pPr>
       <w:r>
         <w:tab/>
-      </w:r>
-      <w:proofErr w:type="spellStart"/>
-      <w:r>
         <w:t>Employee_ID</w:t>
       </w:r>
-      <w:proofErr w:type="spellEnd"/>
     </w:p>
     <w:p>
       <w:pPr>
@@ -2678,12 +2497,8 @@
       </w:pPr>
       <w:r>
         <w:tab/>
-      </w:r>
-      <w:proofErr w:type="spellStart"/>
-      <w:r>
         <w:t>First_Name</w:t>
       </w:r>
-      <w:proofErr w:type="spellEnd"/>
     </w:p>
     <w:p>
       <w:pPr>
@@ -2692,12 +2507,8 @@
       </w:pPr>
       <w:r>
         <w:tab/>
-      </w:r>
-      <w:proofErr w:type="spellStart"/>
-      <w:r>
         <w:t>Last_name</w:t>
       </w:r>
-      <w:proofErr w:type="spellEnd"/>
     </w:p>
     <w:p>
       <w:pPr>
@@ -2706,12 +2517,8 @@
       </w:pPr>
       <w:r>
         <w:tab/>
-      </w:r>
-      <w:proofErr w:type="spellStart"/>
-      <w:r>
         <w:t>Date_of_Birth</w:t>
       </w:r>
-      <w:proofErr w:type="spellEnd"/>
     </w:p>
     <w:p>
       <w:pPr>
@@ -2720,12 +2527,8 @@
       </w:pPr>
       <w:r>
         <w:tab/>
-      </w:r>
-      <w:proofErr w:type="spellStart"/>
-      <w:r>
         <w:t>Personal_ID</w:t>
       </w:r>
-      <w:proofErr w:type="spellEnd"/>
     </w:p>
     <w:p>
       <w:pPr>
@@ -2734,12 +2537,8 @@
       </w:pPr>
       <w:r>
         <w:tab/>
-      </w:r>
-      <w:proofErr w:type="spellStart"/>
-      <w:r>
         <w:t>Phone_number</w:t>
       </w:r>
-      <w:proofErr w:type="spellEnd"/>
     </w:p>
     <w:p>
       <w:pPr>
@@ -2760,12 +2559,8 @@
       </w:pPr>
       <w:r>
         <w:tab/>
-      </w:r>
-      <w:proofErr w:type="spellStart"/>
-      <w:r>
         <w:t>Channels_ID</w:t>
       </w:r>
-      <w:proofErr w:type="spellEnd"/>
     </w:p>
     <w:p>
       <w:pPr>
@@ -2773,12 +2568,8 @@
       </w:pPr>
       <w:r>
         <w:tab/>
-      </w:r>
-      <w:proofErr w:type="spellStart"/>
-      <w:r>
         <w:t>Channels_Name</w:t>
       </w:r>
-      <w:proofErr w:type="spellEnd"/>
     </w:p>
     <w:p>
       <w:pPr>
@@ -2786,12 +2577,8 @@
       </w:pPr>
       <w:r>
         <w:tab/>
-      </w:r>
-      <w:proofErr w:type="spellStart"/>
-      <w:r>
         <w:t>Channels_Desc</w:t>
       </w:r>
-      <w:proofErr w:type="spellEnd"/>
     </w:p>
     <w:p>
       <w:pPr>
@@ -2831,9 +2618,435 @@
           <w:b/>
           <w:bCs/>
         </w:rPr>
-        <w:t>Order ID</w:t>
-      </w:r>
-      <w:proofErr w:type="gramStart"/>
+        <w:t>Order ID:</w:t>
+      </w:r>
+      <w:r>
+        <w:t xml:space="preserve"> </w:t>
+      </w:r>
+      <w:r>
+        <w:t xml:space="preserve"> </w:t>
+      </w:r>
+      <w:r>
+        <w:t>A unique identifier for each transaction (e.g., ORD-000001).</w:t>
+      </w:r>
+    </w:p>
+    <w:p>
+      <w:pPr>
+        <w:pStyle w:val="BodyText"/>
+        <w:numPr>
+          <w:ilvl w:val="0"/>
+          <w:numId w:val="52"/>
+        </w:numPr>
+      </w:pPr>
+      <w:r>
+        <w:rPr>
+          <w:b/>
+          <w:bCs/>
+        </w:rPr>
+        <w:t>Item Price:</w:t>
+      </w:r>
+      <w:r>
+        <w:t xml:space="preserve"> The base price of the product before any discounts (e.g., 42.0 for Aalopuri, 9.0 for Cold Coffee).</w:t>
+      </w:r>
+    </w:p>
+    <w:p>
+      <w:pPr>
+        <w:pStyle w:val="BodyText"/>
+        <w:numPr>
+          <w:ilvl w:val="0"/>
+          <w:numId w:val="52"/>
+        </w:numPr>
+      </w:pPr>
+      <w:r>
+        <w:rPr>
+          <w:b/>
+          <w:bCs/>
+        </w:rPr>
+        <w:t>Quantity:</w:t>
+      </w:r>
+      <w:r>
+        <w:t xml:space="preserve"> The number of units of the product purchased in the transaction.</w:t>
+      </w:r>
+    </w:p>
+    <w:p>
+      <w:pPr>
+        <w:pStyle w:val="BodyText"/>
+        <w:numPr>
+          <w:ilvl w:val="0"/>
+          <w:numId w:val="52"/>
+        </w:numPr>
+      </w:pPr>
+      <w:r>
+        <w:rPr>
+          <w:b/>
+          <w:bCs/>
+        </w:rPr>
+        <w:t>Transaction Amount:</w:t>
+      </w:r>
+      <w:r>
+        <w:t xml:space="preserve"> The total amount paid by the customer after applying discounts, calculated as Item Price × Quantity - Discount.</w:t>
+      </w:r>
+    </w:p>
+    <w:p>
+      <w:pPr>
+        <w:pStyle w:val="BodyText"/>
+        <w:numPr>
+          <w:ilvl w:val="0"/>
+          <w:numId w:val="52"/>
+        </w:numPr>
+      </w:pPr>
+      <w:r>
+        <w:rPr>
+          <w:b/>
+          <w:bCs/>
+        </w:rPr>
+        <w:t>Transaction Type:</w:t>
+      </w:r>
+      <w:r>
+        <w:t xml:space="preserve"> The method of payment used (e.g., </w:t>
+      </w:r>
+      <w:r>
+        <w:rPr>
+          <w:i/>
+          <w:iCs/>
+        </w:rPr>
+        <w:t>Ca</w:t>
+      </w:r>
+      <w:r>
+        <w:rPr>
+          <w:i/>
+          <w:iCs/>
+        </w:rPr>
+        <w:t>sh</w:t>
+      </w:r>
+      <w:r>
+        <w:t>).</w:t>
+      </w:r>
+    </w:p>
+    <w:p>
+      <w:pPr>
+        <w:pStyle w:val="BodyText"/>
+      </w:pPr>
+    </w:p>
+    <w:p>
+      <w:pPr>
+        <w:pStyle w:val="BodyText"/>
+      </w:pPr>
+    </w:p>
+    <w:p>
+      <w:pPr>
+        <w:pStyle w:val="BodyText"/>
+      </w:pPr>
+      <w:r>
+        <w:t xml:space="preserve">The </w:t>
+      </w:r>
+      <w:r>
+        <w:t>second</w:t>
+      </w:r>
+      <w:r>
+        <w:t xml:space="preserve"> dataset </w:t>
+      </w:r>
+      <w:r>
+        <w:t>contains the following information</w:t>
+      </w:r>
+    </w:p>
+    <w:p>
+      <w:pPr>
+        <w:pStyle w:val="Subtitle"/>
+      </w:pPr>
+      <w:r>
+        <w:t xml:space="preserve">Fastfood Point </w:t>
+      </w:r>
+      <w:r>
+        <w:t>(Future dimension)</w:t>
+      </w:r>
+      <w:r>
+        <w:t>:</w:t>
+      </w:r>
+      <w:r>
+        <w:t xml:space="preserve"> </w:t>
+      </w:r>
+    </w:p>
+    <w:p>
+      <w:pPr>
+        <w:pStyle w:val="BodyText"/>
+        <w:numPr>
+          <w:ilvl w:val="0"/>
+          <w:numId w:val="46"/>
+        </w:numPr>
+      </w:pPr>
+      <w:r>
+        <w:rPr>
+          <w:b/>
+          <w:bCs/>
+        </w:rPr>
+        <w:t>Point Name:</w:t>
+      </w:r>
+      <w:r>
+        <w:t xml:space="preserve"> The name of the fast food outlet (e.g., Balaji_1, Balaji_2).</w:t>
+      </w:r>
+    </w:p>
+    <w:p>
+      <w:pPr>
+        <w:pStyle w:val="BodyText"/>
+        <w:numPr>
+          <w:ilvl w:val="0"/>
+          <w:numId w:val="46"/>
+        </w:numPr>
+      </w:pPr>
+      <w:r>
+        <w:rPr>
+          <w:b/>
+          <w:bCs/>
+        </w:rPr>
+        <w:t xml:space="preserve">Point </w:t>
+      </w:r>
+      <w:r>
+        <w:rPr>
+          <w:b/>
+          <w:bCs/>
+        </w:rPr>
+        <w:t>City:</w:t>
+      </w:r>
+      <w:r>
+        <w:t xml:space="preserve"> The city where the outlet is located (e.g., Atyrau, Almaty).</w:t>
+      </w:r>
+    </w:p>
+    <w:p>
+      <w:pPr>
+        <w:pStyle w:val="BodyText"/>
+        <w:numPr>
+          <w:ilvl w:val="0"/>
+          <w:numId w:val="46"/>
+        </w:numPr>
+      </w:pPr>
+      <w:r>
+        <w:rPr>
+          <w:b/>
+          <w:bCs/>
+        </w:rPr>
+        <w:t xml:space="preserve">Point </w:t>
+      </w:r>
+      <w:r>
+        <w:rPr>
+          <w:b/>
+          <w:bCs/>
+        </w:rPr>
+        <w:t>Address:</w:t>
+      </w:r>
+      <w:r>
+        <w:t xml:space="preserve"> The exact address of the outlet (e.g., Satpaeva 127, Abay 99).</w:t>
+      </w:r>
+    </w:p>
+    <w:p>
+      <w:pPr>
+        <w:pStyle w:val="BodyText"/>
+        <w:numPr>
+          <w:ilvl w:val="0"/>
+          <w:numId w:val="46"/>
+        </w:numPr>
+      </w:pPr>
+      <w:r>
+        <w:rPr>
+          <w:b/>
+          <w:bCs/>
+        </w:rPr>
+        <w:t xml:space="preserve">Point </w:t>
+      </w:r>
+      <w:r>
+        <w:rPr>
+          <w:b/>
+          <w:bCs/>
+        </w:rPr>
+        <w:t>Country:</w:t>
+      </w:r>
+      <w:r>
+        <w:t xml:space="preserve"> The country of operation (</w:t>
+      </w:r>
+      <w:r>
+        <w:rPr>
+          <w:i/>
+          <w:iCs/>
+        </w:rPr>
+        <w:t>Kazakhstan</w:t>
+      </w:r>
+      <w:r>
+        <w:t>).</w:t>
+      </w:r>
+    </w:p>
+    <w:p>
+      <w:pPr>
+        <w:pStyle w:val="BodyText"/>
+        <w:ind w:left="720"/>
+      </w:pPr>
+      <w:r>
+        <w:rPr>
+          <w:b/>
+          <w:bCs/>
+        </w:rPr>
+        <w:t>Attributes of future dimension table (hierarchy):</w:t>
+      </w:r>
+    </w:p>
+    <w:p>
+      <w:pPr>
+        <w:pStyle w:val="BodyText"/>
+        <w:ind w:left="720"/>
+      </w:pPr>
+      <w:r>
+        <w:tab/>
+        <w:t>Country (Country_ID, country_name)-&gt;City(City_ID, City_name, Country_ID(FK))-&gt;Fast food point (Point_ID, Address, City_ID(FK))</w:t>
+      </w:r>
+    </w:p>
+    <w:p>
+      <w:pPr>
+        <w:pStyle w:val="BodyText"/>
+        <w:ind w:left="720"/>
+      </w:pPr>
+    </w:p>
+    <w:p>
+      <w:pPr>
+        <w:pStyle w:val="Subtitle"/>
+      </w:pPr>
+      <w:r>
+        <w:lastRenderedPageBreak/>
+        <w:t>Customer</w:t>
+      </w:r>
+      <w:r>
+        <w:t>s (Future dimension)</w:t>
+      </w:r>
+      <w:r>
+        <w:t>:</w:t>
+      </w:r>
+    </w:p>
+    <w:p>
+      <w:pPr>
+        <w:pStyle w:val="BodyText"/>
+        <w:numPr>
+          <w:ilvl w:val="0"/>
+          <w:numId w:val="47"/>
+        </w:numPr>
+      </w:pPr>
+      <w:r>
+        <w:rPr>
+          <w:b/>
+          <w:bCs/>
+        </w:rPr>
+        <w:t xml:space="preserve">Customer </w:t>
+      </w:r>
+      <w:r>
+        <w:rPr>
+          <w:b/>
+          <w:bCs/>
+        </w:rPr>
+        <w:t xml:space="preserve">First/Last </w:t>
+      </w:r>
+      <w:r>
+        <w:rPr>
+          <w:b/>
+          <w:bCs/>
+        </w:rPr>
+        <w:t>Name:</w:t>
+      </w:r>
+      <w:r>
+        <w:t xml:space="preserve"> The name of the customer (e.g., generated using Faker for anonymization).</w:t>
+      </w:r>
+    </w:p>
+    <w:p>
+      <w:pPr>
+        <w:pStyle w:val="BodyText"/>
+        <w:numPr>
+          <w:ilvl w:val="0"/>
+          <w:numId w:val="47"/>
+        </w:numPr>
+      </w:pPr>
+      <w:r>
+        <w:t>Customer Phone Number</w:t>
+      </w:r>
+    </w:p>
+    <w:p>
+      <w:pPr>
+        <w:pStyle w:val="BodyText"/>
+        <w:ind w:left="720"/>
+      </w:pPr>
+      <w:r>
+        <w:rPr>
+          <w:b/>
+          <w:bCs/>
+        </w:rPr>
+        <w:t>Attributes of future dimension table:</w:t>
+      </w:r>
+    </w:p>
+    <w:p>
+      <w:pPr>
+        <w:pStyle w:val="BodyText"/>
+        <w:ind w:left="720"/>
+      </w:pPr>
+      <w:r>
+        <w:tab/>
+        <w:t>Cust_id</w:t>
+      </w:r>
+    </w:p>
+    <w:p>
+      <w:pPr>
+        <w:pStyle w:val="BodyText"/>
+        <w:ind w:left="720" w:firstLine="720"/>
+      </w:pPr>
+      <w:r>
+        <w:t>First_name</w:t>
+      </w:r>
+    </w:p>
+    <w:p>
+      <w:pPr>
+        <w:pStyle w:val="BodyText"/>
+        <w:ind w:left="720" w:firstLine="720"/>
+      </w:pPr>
+      <w:r>
+        <w:t>Last_name</w:t>
+      </w:r>
+      <w:r>
+        <w:br/>
+      </w:r>
+      <w:r>
+        <w:tab/>
+        <w:t>Phone number</w:t>
+      </w:r>
+    </w:p>
+    <w:p>
+      <w:pPr>
+        <w:pStyle w:val="Subtitle"/>
+      </w:pPr>
+      <w:r>
+        <w:t>Discount</w:t>
+      </w:r>
+      <w:r>
+        <w:t xml:space="preserve"> (Future dimension)</w:t>
+      </w:r>
+      <w:r>
+        <w:t>:</w:t>
+      </w:r>
+    </w:p>
+    <w:p>
+      <w:pPr>
+        <w:pStyle w:val="BodyText"/>
+        <w:numPr>
+          <w:ilvl w:val="0"/>
+          <w:numId w:val="48"/>
+        </w:numPr>
+      </w:pPr>
+      <w:r>
+        <w:rPr>
+          <w:b/>
+          <w:bCs/>
+        </w:rPr>
+        <w:t>Discoun</w:t>
+      </w:r>
+      <w:r>
+        <w:rPr>
+          <w:b/>
+          <w:bCs/>
+        </w:rPr>
+        <w:t>t%</w:t>
+      </w:r>
       <w:r>
         <w:rPr>
           <w:b/>
@@ -2842,440 +3055,7 @@
         <w:t>:</w:t>
       </w:r>
       <w:r>
-        <w:t xml:space="preserve"> </w:t>
-      </w:r>
-      <w:r>
-        <w:t xml:space="preserve"> </w:t>
-      </w:r>
-      <w:r>
-        <w:t>A</w:t>
-      </w:r>
-      <w:proofErr w:type="gramEnd"/>
-      <w:r>
-        <w:t xml:space="preserve"> unique identifier for each transaction (e.g., ORD-000001).</w:t>
-      </w:r>
-    </w:p>
-    <w:p>
-      <w:pPr>
-        <w:pStyle w:val="BodyText"/>
-        <w:numPr>
-          <w:ilvl w:val="0"/>
-          <w:numId w:val="52"/>
-        </w:numPr>
-      </w:pPr>
-      <w:r>
-        <w:rPr>
-          <w:b/>
-          <w:bCs/>
-        </w:rPr>
-        <w:t>Item Price:</w:t>
-      </w:r>
-      <w:r>
-        <w:t xml:space="preserve"> The base price of the product before any discounts (e.g., 42.0 for </w:t>
-      </w:r>
-      <w:proofErr w:type="spellStart"/>
-      <w:r>
-        <w:t>Aalopuri</w:t>
-      </w:r>
-      <w:proofErr w:type="spellEnd"/>
-      <w:r>
-        <w:t>, 9.0 for Cold Coffee).</w:t>
-      </w:r>
-    </w:p>
-    <w:p>
-      <w:pPr>
-        <w:pStyle w:val="BodyText"/>
-        <w:numPr>
-          <w:ilvl w:val="0"/>
-          <w:numId w:val="52"/>
-        </w:numPr>
-      </w:pPr>
-      <w:r>
-        <w:rPr>
-          <w:b/>
-          <w:bCs/>
-        </w:rPr>
-        <w:t>Quantity:</w:t>
-      </w:r>
-      <w:r>
-        <w:t xml:space="preserve"> The number of units of the product purchased in the transaction.</w:t>
-      </w:r>
-    </w:p>
-    <w:p>
-      <w:pPr>
-        <w:pStyle w:val="BodyText"/>
-        <w:numPr>
-          <w:ilvl w:val="0"/>
-          <w:numId w:val="52"/>
-        </w:numPr>
-      </w:pPr>
-      <w:r>
-        <w:rPr>
-          <w:b/>
-          <w:bCs/>
-        </w:rPr>
-        <w:t>Transaction Amount:</w:t>
-      </w:r>
-      <w:r>
-        <w:t xml:space="preserve"> The total amount paid by the customer after applying discounts, calculated as Item Price × Quantity - Discount.</w:t>
-      </w:r>
-    </w:p>
-    <w:p>
-      <w:pPr>
-        <w:pStyle w:val="BodyText"/>
-        <w:numPr>
-          <w:ilvl w:val="0"/>
-          <w:numId w:val="52"/>
-        </w:numPr>
-      </w:pPr>
-      <w:r>
-        <w:rPr>
-          <w:b/>
-          <w:bCs/>
-        </w:rPr>
-        <w:t>Transaction Type:</w:t>
-      </w:r>
-      <w:r>
-        <w:t xml:space="preserve"> The method of payment used (e.g., </w:t>
-      </w:r>
-      <w:r>
-        <w:rPr>
-          <w:i/>
-          <w:iCs/>
-        </w:rPr>
-        <w:t>Ca</w:t>
-      </w:r>
-      <w:r>
-        <w:rPr>
-          <w:i/>
-          <w:iCs/>
-        </w:rPr>
-        <w:t>sh</w:t>
-      </w:r>
-      <w:r>
-        <w:t>).</w:t>
-      </w:r>
-    </w:p>
-    <w:p>
-      <w:pPr>
-        <w:pStyle w:val="BodyText"/>
-      </w:pPr>
-    </w:p>
-    <w:p>
-      <w:pPr>
-        <w:pStyle w:val="BodyText"/>
-      </w:pPr>
-    </w:p>
-    <w:p>
-      <w:pPr>
-        <w:pStyle w:val="BodyText"/>
-      </w:pPr>
-      <w:r>
-        <w:t xml:space="preserve">The </w:t>
-      </w:r>
-      <w:r>
-        <w:t>second</w:t>
-      </w:r>
-      <w:r>
-        <w:t xml:space="preserve"> dataset </w:t>
-      </w:r>
-      <w:r>
-        <w:t>contains the following information</w:t>
-      </w:r>
-    </w:p>
-    <w:p>
-      <w:pPr>
-        <w:pStyle w:val="Subtitle"/>
-      </w:pPr>
-      <w:proofErr w:type="spellStart"/>
-      <w:r>
-        <w:t>Fastfood</w:t>
-      </w:r>
-      <w:proofErr w:type="spellEnd"/>
-      <w:r>
-        <w:t xml:space="preserve"> Point </w:t>
-      </w:r>
-      <w:r>
-        <w:t>(Future dimension)</w:t>
-      </w:r>
-      <w:r>
-        <w:t>:</w:t>
-      </w:r>
-      <w:r>
-        <w:t xml:space="preserve"> </w:t>
-      </w:r>
-    </w:p>
-    <w:p>
-      <w:pPr>
-        <w:pStyle w:val="BodyText"/>
-        <w:numPr>
-          <w:ilvl w:val="0"/>
-          <w:numId w:val="46"/>
-        </w:numPr>
-      </w:pPr>
-      <w:r>
-        <w:rPr>
-          <w:b/>
-          <w:bCs/>
-        </w:rPr>
-        <w:t>Point Name:</w:t>
-      </w:r>
-      <w:r>
-        <w:t xml:space="preserve"> The name of the </w:t>
-      </w:r>
-      <w:proofErr w:type="gramStart"/>
-      <w:r>
-        <w:t>fast food</w:t>
-      </w:r>
-      <w:proofErr w:type="gramEnd"/>
-      <w:r>
-        <w:t xml:space="preserve"> outlet (e.g., Balaji_1, Balaji_2).</w:t>
-      </w:r>
-    </w:p>
-    <w:p>
-      <w:pPr>
-        <w:pStyle w:val="BodyText"/>
-        <w:numPr>
-          <w:ilvl w:val="0"/>
-          <w:numId w:val="46"/>
-        </w:numPr>
-      </w:pPr>
-      <w:r>
-        <w:rPr>
-          <w:b/>
-          <w:bCs/>
-        </w:rPr>
-        <w:t xml:space="preserve">Point </w:t>
-      </w:r>
-      <w:r>
-        <w:rPr>
-          <w:b/>
-          <w:bCs/>
-        </w:rPr>
-        <w:t>City:</w:t>
-      </w:r>
-      <w:r>
-        <w:t xml:space="preserve"> The city where the outlet is located (e.g., Atyrau, Almaty).</w:t>
-      </w:r>
-    </w:p>
-    <w:p>
-      <w:pPr>
-        <w:pStyle w:val="BodyText"/>
-        <w:numPr>
-          <w:ilvl w:val="0"/>
-          <w:numId w:val="46"/>
-        </w:numPr>
-      </w:pPr>
-      <w:r>
-        <w:rPr>
-          <w:b/>
-          <w:bCs/>
-        </w:rPr>
-        <w:t xml:space="preserve">Point </w:t>
-      </w:r>
-      <w:r>
-        <w:rPr>
-          <w:b/>
-          <w:bCs/>
-        </w:rPr>
-        <w:t>Address:</w:t>
-      </w:r>
-      <w:r>
-        <w:t xml:space="preserve"> The exact address of the outlet (e.g., </w:t>
-      </w:r>
-      <w:proofErr w:type="spellStart"/>
-      <w:r>
-        <w:t>Satpaeva</w:t>
-      </w:r>
-      <w:proofErr w:type="spellEnd"/>
-      <w:r>
-        <w:t xml:space="preserve"> 127, Abay 99).</w:t>
-      </w:r>
-    </w:p>
-    <w:p>
-      <w:pPr>
-        <w:pStyle w:val="BodyText"/>
-        <w:numPr>
-          <w:ilvl w:val="0"/>
-          <w:numId w:val="46"/>
-        </w:numPr>
-      </w:pPr>
-      <w:r>
-        <w:rPr>
-          <w:b/>
-          <w:bCs/>
-        </w:rPr>
-        <w:t xml:space="preserve">Point </w:t>
-      </w:r>
-      <w:r>
-        <w:rPr>
-          <w:b/>
-          <w:bCs/>
-        </w:rPr>
-        <w:t>Country:</w:t>
-      </w:r>
-      <w:r>
-        <w:t xml:space="preserve"> The country of operation (</w:t>
-      </w:r>
-      <w:r>
-        <w:rPr>
-          <w:i/>
-          <w:iCs/>
-        </w:rPr>
-        <w:t>Kazakhstan</w:t>
-      </w:r>
-      <w:r>
-        <w:t>).</w:t>
-      </w:r>
-    </w:p>
-    <w:p>
-      <w:pPr>
-        <w:pStyle w:val="BodyText"/>
-        <w:ind w:left="720"/>
-      </w:pPr>
-      <w:r>
-        <w:rPr>
-          <w:b/>
-          <w:bCs/>
-        </w:rPr>
-        <w:t>Attributes of future dimension table (hierarchy):</w:t>
-      </w:r>
-    </w:p>
-    <w:p>
-      <w:pPr>
-        <w:pStyle w:val="BodyText"/>
-        <w:ind w:left="720"/>
-      </w:pPr>
-      <w:r>
-        <w:tab/>
-        <w:t>Country (</w:t>
-      </w:r>
-      <w:proofErr w:type="spellStart"/>
-      <w:r>
-        <w:t>Country_ID</w:t>
-      </w:r>
-      <w:proofErr w:type="spellEnd"/>
-      <w:r>
-        <w:t xml:space="preserve">, </w:t>
-      </w:r>
-      <w:proofErr w:type="spellStart"/>
-      <w:r>
-        <w:t>country_name</w:t>
-      </w:r>
-      <w:proofErr w:type="spellEnd"/>
-      <w:r>
-        <w:t>)-&gt;</w:t>
-      </w:r>
-      <w:proofErr w:type="gramStart"/>
-      <w:r>
-        <w:t>City(</w:t>
-      </w:r>
-      <w:proofErr w:type="spellStart"/>
-      <w:proofErr w:type="gramEnd"/>
-      <w:r>
-        <w:t>City_ID</w:t>
-      </w:r>
-      <w:proofErr w:type="spellEnd"/>
-      <w:r>
-        <w:t xml:space="preserve">, </w:t>
-      </w:r>
-      <w:proofErr w:type="spellStart"/>
-      <w:r>
-        <w:t>City_name</w:t>
-      </w:r>
-      <w:proofErr w:type="spellEnd"/>
-      <w:r>
-        <w:t xml:space="preserve">, </w:t>
-      </w:r>
-      <w:proofErr w:type="spellStart"/>
-      <w:r>
-        <w:t>Country_ID</w:t>
-      </w:r>
-      <w:proofErr w:type="spellEnd"/>
-      <w:r>
-        <w:t>(FK))-&gt;Fast food point (</w:t>
-      </w:r>
-      <w:proofErr w:type="spellStart"/>
-      <w:r>
-        <w:t>Point_ID</w:t>
-      </w:r>
-      <w:proofErr w:type="spellEnd"/>
-      <w:r>
-        <w:t xml:space="preserve">, Address, </w:t>
-      </w:r>
-      <w:proofErr w:type="spellStart"/>
-      <w:r>
-        <w:t>City_ID</w:t>
-      </w:r>
-      <w:proofErr w:type="spellEnd"/>
-      <w:r>
-        <w:t>(FK))</w:t>
-      </w:r>
-    </w:p>
-    <w:p>
-      <w:pPr>
-        <w:pStyle w:val="BodyText"/>
-        <w:ind w:left="720"/>
-      </w:pPr>
-    </w:p>
-    <w:p>
-      <w:pPr>
-        <w:pStyle w:val="Subtitle"/>
-      </w:pPr>
-      <w:r>
-        <w:lastRenderedPageBreak/>
-        <w:t>Customer</w:t>
-      </w:r>
-      <w:r>
-        <w:t>s (Future dimension)</w:t>
-      </w:r>
-      <w:r>
-        <w:t>:</w:t>
-      </w:r>
-    </w:p>
-    <w:p>
-      <w:pPr>
-        <w:pStyle w:val="BodyText"/>
-        <w:numPr>
-          <w:ilvl w:val="0"/>
-          <w:numId w:val="47"/>
-        </w:numPr>
-      </w:pPr>
-      <w:r>
-        <w:rPr>
-          <w:b/>
-          <w:bCs/>
-        </w:rPr>
-        <w:t xml:space="preserve">Customer </w:t>
-      </w:r>
-      <w:r>
-        <w:rPr>
-          <w:b/>
-          <w:bCs/>
-        </w:rPr>
-        <w:t xml:space="preserve">First/Last </w:t>
-      </w:r>
-      <w:r>
-        <w:rPr>
-          <w:b/>
-          <w:bCs/>
-        </w:rPr>
-        <w:t>Name:</w:t>
-      </w:r>
-      <w:r>
-        <w:t xml:space="preserve"> The name of the customer (e.g., generated using Faker for anonymization).</w:t>
-      </w:r>
-    </w:p>
-    <w:p>
-      <w:pPr>
-        <w:pStyle w:val="BodyText"/>
-        <w:numPr>
-          <w:ilvl w:val="0"/>
-          <w:numId w:val="47"/>
-        </w:numPr>
-      </w:pPr>
-      <w:r>
-        <w:t>Customer Phone Number</w:t>
+        <w:t xml:space="preserve"> The percentage of discount applied to a transaction (e.g., 10%, 15%, 20%).</w:t>
       </w:r>
     </w:p>
     <w:p>
@@ -3298,48 +3078,41 @@
       </w:pPr>
       <w:r>
         <w:tab/>
-      </w:r>
-      <w:proofErr w:type="spellStart"/>
-      <w:r>
-        <w:t>Cust_id</w:t>
-      </w:r>
-      <w:proofErr w:type="spellEnd"/>
-    </w:p>
-    <w:p>
-      <w:pPr>
-        <w:pStyle w:val="BodyText"/>
-        <w:ind w:left="720" w:firstLine="720"/>
-      </w:pPr>
-      <w:proofErr w:type="spellStart"/>
-      <w:r>
-        <w:t>First_name</w:t>
-      </w:r>
-      <w:proofErr w:type="spellEnd"/>
-    </w:p>
-    <w:p>
-      <w:pPr>
-        <w:pStyle w:val="BodyText"/>
-        <w:ind w:left="720" w:firstLine="720"/>
-      </w:pPr>
-      <w:proofErr w:type="spellStart"/>
-      <w:r>
-        <w:t>Last_name</w:t>
-      </w:r>
-      <w:proofErr w:type="spellEnd"/>
-      <w:r>
-        <w:br/>
-      </w:r>
+        <w:t>Discount_ID</w:t>
+      </w:r>
+    </w:p>
+    <w:p>
+      <w:pPr>
+        <w:pStyle w:val="BodyText"/>
+        <w:ind w:left="720"/>
+      </w:pPr>
       <w:r>
         <w:tab/>
-        <w:t>Phone number</w:t>
-      </w:r>
+        <w:t>Date_of_discount</w:t>
+      </w:r>
+    </w:p>
+    <w:p>
+      <w:pPr>
+        <w:pStyle w:val="BodyText"/>
+        <w:ind w:left="720"/>
+      </w:pPr>
+      <w:r>
+        <w:tab/>
+        <w:t>Percentage</w:t>
+      </w:r>
+    </w:p>
+    <w:p>
+      <w:pPr>
+        <w:pStyle w:val="BodyText"/>
+        <w:ind w:left="720"/>
+      </w:pPr>
     </w:p>
     <w:p>
       <w:pPr>
         <w:pStyle w:val="Subtitle"/>
       </w:pPr>
       <w:r>
-        <w:t>Discount</w:t>
+        <w:t>Product</w:t>
       </w:r>
       <w:r>
         <w:t xml:space="preserve"> (Future dimension)</w:t>
@@ -3353,7 +3126,7 @@
         <w:pStyle w:val="BodyText"/>
         <w:numPr>
           <w:ilvl w:val="0"/>
-          <w:numId w:val="48"/>
+          <w:numId w:val="49"/>
         </w:numPr>
       </w:pPr>
       <w:r>
@@ -3361,30 +3134,73 @@
           <w:b/>
           <w:bCs/>
         </w:rPr>
-        <w:t>Discoun</w:t>
+        <w:t>Product</w:t>
       </w:r>
       <w:r>
         <w:rPr>
           <w:b/>
           <w:bCs/>
         </w:rPr>
-        <w:t>t%</w:t>
-      </w:r>
+        <w:t xml:space="preserve"> Name:</w:t>
+      </w:r>
+      <w:r>
+        <w:t xml:space="preserve"> The name of the product sold (e.g., Aalopuri, Panipuri, Cold Coffee).</w:t>
+      </w:r>
+    </w:p>
+    <w:p>
+      <w:pPr>
+        <w:pStyle w:val="BodyText"/>
+        <w:numPr>
+          <w:ilvl w:val="0"/>
+          <w:numId w:val="49"/>
+        </w:numPr>
+      </w:pPr>
       <w:r>
         <w:rPr>
           <w:b/>
           <w:bCs/>
         </w:rPr>
-        <w:t>:</w:t>
-      </w:r>
-      <w:r>
-        <w:t xml:space="preserve"> The percentage of discount applied to a transaction (e.g., 10%, 15%, 20%).</w:t>
+        <w:t>Product</w:t>
+      </w:r>
+      <w:r>
+        <w:rPr>
+          <w:b/>
+          <w:bCs/>
+        </w:rPr>
+        <w:t xml:space="preserve"> Type:</w:t>
+      </w:r>
+      <w:r>
+        <w:t xml:space="preserve"> The category of the product, either </w:t>
+      </w:r>
+      <w:r>
+        <w:rPr>
+          <w:i/>
+          <w:iCs/>
+        </w:rPr>
+        <w:t>Fastfood</w:t>
+      </w:r>
+      <w:r>
+        <w:t xml:space="preserve"> or </w:t>
+      </w:r>
+      <w:r>
+        <w:rPr>
+          <w:i/>
+          <w:iCs/>
+        </w:rPr>
+        <w:t>Beverages</w:t>
+      </w:r>
+      <w:r>
+        <w:t>.</w:t>
       </w:r>
     </w:p>
     <w:p>
       <w:pPr>
         <w:pStyle w:val="BodyText"/>
         <w:ind w:left="720"/>
+        <w:rPr>
+          <w:b/>
+          <w:bCs/>
+        </w:rPr>
       </w:pPr>
       <w:r>
         <w:rPr>
@@ -3400,183 +3216,11 @@
         <w:ind w:left="720"/>
       </w:pPr>
       <w:r>
-        <w:tab/>
-      </w:r>
-      <w:proofErr w:type="spellStart"/>
-      <w:r>
-        <w:t>Discount_ID</w:t>
-      </w:r>
-      <w:proofErr w:type="spellEnd"/>
-    </w:p>
-    <w:p>
-      <w:pPr>
-        <w:pStyle w:val="BodyText"/>
-        <w:ind w:left="720"/>
-      </w:pPr>
-      <w:r>
-        <w:tab/>
-      </w:r>
-      <w:proofErr w:type="spellStart"/>
-      <w:r>
-        <w:t>Date_of_discount</w:t>
-      </w:r>
-      <w:proofErr w:type="spellEnd"/>
-    </w:p>
-    <w:p>
-      <w:pPr>
-        <w:pStyle w:val="BodyText"/>
-        <w:ind w:left="720"/>
-      </w:pPr>
-      <w:r>
-        <w:tab/>
-        <w:t>Percentage</w:t>
-      </w:r>
-    </w:p>
-    <w:p>
-      <w:pPr>
-        <w:pStyle w:val="BodyText"/>
-        <w:ind w:left="720"/>
-      </w:pPr>
-    </w:p>
-    <w:p>
-      <w:pPr>
-        <w:pStyle w:val="Subtitle"/>
-      </w:pPr>
-      <w:r>
-        <w:t>Product</w:t>
-      </w:r>
-      <w:r>
-        <w:t xml:space="preserve"> (Future dimension)</w:t>
-      </w:r>
-      <w:r>
-        <w:t>:</w:t>
-      </w:r>
-    </w:p>
-    <w:p>
-      <w:pPr>
-        <w:pStyle w:val="BodyText"/>
-        <w:numPr>
-          <w:ilvl w:val="0"/>
-          <w:numId w:val="49"/>
-        </w:numPr>
-      </w:pPr>
-      <w:r>
-        <w:rPr>
-          <w:b/>
-          <w:bCs/>
-        </w:rPr>
-        <w:t>Product</w:t>
-      </w:r>
-      <w:r>
-        <w:rPr>
-          <w:b/>
-          <w:bCs/>
-        </w:rPr>
-        <w:t xml:space="preserve"> Name:</w:t>
-      </w:r>
-      <w:r>
-        <w:t xml:space="preserve"> The name of the product sold (e.g., </w:t>
-      </w:r>
-      <w:proofErr w:type="spellStart"/>
-      <w:r>
-        <w:t>Aalopuri</w:t>
-      </w:r>
-      <w:proofErr w:type="spellEnd"/>
-      <w:r>
-        <w:t xml:space="preserve">, </w:t>
-      </w:r>
-      <w:proofErr w:type="spellStart"/>
-      <w:r>
-        <w:t>Panipuri</w:t>
-      </w:r>
-      <w:proofErr w:type="spellEnd"/>
-      <w:r>
-        <w:t>, Cold Coffee).</w:t>
-      </w:r>
-    </w:p>
-    <w:p>
-      <w:pPr>
-        <w:pStyle w:val="BodyText"/>
-        <w:numPr>
-          <w:ilvl w:val="0"/>
-          <w:numId w:val="49"/>
-        </w:numPr>
-      </w:pPr>
-      <w:r>
-        <w:rPr>
-          <w:b/>
-          <w:bCs/>
-        </w:rPr>
-        <w:t>Product</w:t>
-      </w:r>
-      <w:r>
-        <w:rPr>
-          <w:b/>
-          <w:bCs/>
-        </w:rPr>
-        <w:t xml:space="preserve"> Type:</w:t>
-      </w:r>
-      <w:r>
-        <w:t xml:space="preserve"> The category of the product, either </w:t>
-      </w:r>
-      <w:proofErr w:type="spellStart"/>
-      <w:r>
-        <w:rPr>
-          <w:i/>
-          <w:iCs/>
-        </w:rPr>
-        <w:t>Fastfood</w:t>
-      </w:r>
-      <w:proofErr w:type="spellEnd"/>
-      <w:r>
-        <w:t xml:space="preserve"> or </w:t>
-      </w:r>
-      <w:r>
-        <w:rPr>
-          <w:i/>
-          <w:iCs/>
-        </w:rPr>
-        <w:t>Beverages</w:t>
-      </w:r>
-      <w:r>
-        <w:t>.</w:t>
-      </w:r>
-    </w:p>
-    <w:p>
-      <w:pPr>
-        <w:pStyle w:val="BodyText"/>
-        <w:ind w:left="720"/>
-        <w:rPr>
-          <w:b/>
-          <w:bCs/>
-        </w:rPr>
-      </w:pPr>
-      <w:r>
-        <w:rPr>
-          <w:b/>
-          <w:bCs/>
-        </w:rPr>
-        <w:t>Attributes of future dimension table:</w:t>
-      </w:r>
-    </w:p>
-    <w:p>
-      <w:pPr>
-        <w:pStyle w:val="BodyText"/>
-        <w:ind w:left="720"/>
-      </w:pPr>
-      <w:r>
         <w:rPr>
           <w:b/>
           <w:bCs/>
         </w:rPr>
         <w:tab/>
-      </w:r>
-      <w:proofErr w:type="gramStart"/>
-      <w:r>
-        <w:rPr>
-          <w:b/>
-          <w:bCs/>
-        </w:rPr>
         <w:t>Category</w:t>
       </w:r>
       <w:r>
@@ -3592,15 +3236,7 @@
           <w:bCs/>
         </w:rPr>
         <w:tab/>
-        <w:t>-</w:t>
-      </w:r>
-      <w:proofErr w:type="gramEnd"/>
-      <w:r>
-        <w:rPr>
-          <w:b/>
-          <w:bCs/>
-        </w:rPr>
-        <w:t>&gt;</w:t>
+        <w:t>-&gt;</w:t>
       </w:r>
       <w:r>
         <w:rPr>
@@ -3616,11 +3252,9 @@
         <w:pStyle w:val="BodyText"/>
         <w:ind w:left="720" w:firstLine="720"/>
       </w:pPr>
-      <w:proofErr w:type="spellStart"/>
       <w:r>
         <w:t>Category_ID</w:t>
       </w:r>
-      <w:proofErr w:type="spellEnd"/>
       <w:r>
         <w:tab/>
       </w:r>
@@ -3639,12 +3273,8 @@
       </w:pPr>
       <w:r>
         <w:tab/>
-      </w:r>
-      <w:proofErr w:type="spellStart"/>
-      <w:r>
         <w:t>Category_name</w:t>
       </w:r>
-      <w:proofErr w:type="spellEnd"/>
       <w:r>
         <w:tab/>
       </w:r>
@@ -3653,12 +3283,8 @@
       </w:r>
       <w:r>
         <w:tab/>
-      </w:r>
-      <w:proofErr w:type="spellStart"/>
-      <w:r>
         <w:t>Prod_name</w:t>
       </w:r>
-      <w:proofErr w:type="spellEnd"/>
     </w:p>
     <w:p>
       <w:pPr>
@@ -3679,14 +3305,7 @@
       </w:r>
       <w:r>
         <w:tab/>
-      </w:r>
-      <w:proofErr w:type="spellStart"/>
-      <w:r>
-        <w:t>Category_ID</w:t>
-      </w:r>
-      <w:proofErr w:type="spellEnd"/>
-      <w:r>
-        <w:t xml:space="preserve"> (FK)</w:t>
+        <w:t>Category_ID (FK)</w:t>
       </w:r>
     </w:p>
     <w:p>
@@ -3708,12 +3327,8 @@
       </w:r>
       <w:r>
         <w:tab/>
-      </w:r>
-      <w:proofErr w:type="spellStart"/>
-      <w:r>
         <w:t>Prod_price</w:t>
       </w:r>
-      <w:proofErr w:type="spellEnd"/>
     </w:p>
     <w:p>
       <w:pPr>
@@ -3791,12 +3406,8 @@
       </w:pPr>
       <w:r>
         <w:tab/>
-      </w:r>
-      <w:proofErr w:type="spellStart"/>
-      <w:r>
         <w:t>Day_of_week</w:t>
       </w:r>
-      <w:proofErr w:type="spellEnd"/>
     </w:p>
     <w:p>
       <w:pPr>
@@ -3894,7 +3505,6 @@
       <w:r>
         <w:t xml:space="preserve">, </w:t>
       </w:r>
-      <w:proofErr w:type="gramStart"/>
       <w:r>
         <w:t xml:space="preserve">Maria </w:t>
       </w:r>
@@ -3904,7 +3514,6 @@
       <w:r>
         <w:t>Petrova</w:t>
       </w:r>
-      <w:proofErr w:type="gramEnd"/>
       <w:r>
         <w:t>).</w:t>
       </w:r>
@@ -3930,12 +3539,8 @@
       </w:pPr>
       <w:r>
         <w:tab/>
-      </w:r>
-      <w:proofErr w:type="spellStart"/>
-      <w:r>
         <w:t>Employee_ID</w:t>
       </w:r>
-      <w:proofErr w:type="spellEnd"/>
     </w:p>
     <w:p>
       <w:pPr>
@@ -3944,12 +3549,8 @@
       </w:pPr>
       <w:r>
         <w:tab/>
-      </w:r>
-      <w:proofErr w:type="spellStart"/>
-      <w:r>
         <w:t>First_Name</w:t>
       </w:r>
-      <w:proofErr w:type="spellEnd"/>
     </w:p>
     <w:p>
       <w:pPr>
@@ -3958,12 +3559,8 @@
       </w:pPr>
       <w:r>
         <w:tab/>
-      </w:r>
-      <w:proofErr w:type="spellStart"/>
-      <w:r>
         <w:t>Last_name</w:t>
       </w:r>
-      <w:proofErr w:type="spellEnd"/>
     </w:p>
     <w:p>
       <w:pPr>
@@ -3972,12 +3569,8 @@
       </w:pPr>
       <w:r>
         <w:tab/>
-      </w:r>
-      <w:proofErr w:type="spellStart"/>
-      <w:r>
         <w:t>Date_of_Birth</w:t>
       </w:r>
-      <w:proofErr w:type="spellEnd"/>
     </w:p>
     <w:p>
       <w:pPr>
@@ -3986,12 +3579,8 @@
       </w:pPr>
       <w:r>
         <w:tab/>
-      </w:r>
-      <w:proofErr w:type="spellStart"/>
-      <w:r>
         <w:t>Personal_ID</w:t>
       </w:r>
-      <w:proofErr w:type="spellEnd"/>
     </w:p>
     <w:p>
       <w:pPr>
@@ -4000,12 +3589,8 @@
       </w:pPr>
       <w:r>
         <w:tab/>
-      </w:r>
-      <w:proofErr w:type="spellStart"/>
-      <w:r>
         <w:t>Phone_number</w:t>
       </w:r>
-      <w:proofErr w:type="spellEnd"/>
     </w:p>
     <w:p>
       <w:pPr>
@@ -4091,12 +3676,8 @@
       </w:pPr>
       <w:r>
         <w:tab/>
-      </w:r>
-      <w:proofErr w:type="spellStart"/>
-      <w:r>
         <w:t>Channels_ID</w:t>
       </w:r>
-      <w:proofErr w:type="spellEnd"/>
     </w:p>
     <w:p>
       <w:pPr>
@@ -4104,12 +3685,8 @@
       </w:pPr>
       <w:r>
         <w:tab/>
-      </w:r>
-      <w:proofErr w:type="spellStart"/>
-      <w:r>
         <w:t>Channels_Name</w:t>
       </w:r>
-      <w:proofErr w:type="spellEnd"/>
     </w:p>
     <w:p>
       <w:pPr>
@@ -4117,12 +3694,8 @@
       </w:pPr>
       <w:r>
         <w:tab/>
-      </w:r>
-      <w:proofErr w:type="spellStart"/>
-      <w:r>
         <w:t>Channels_Desc</w:t>
       </w:r>
-      <w:proofErr w:type="spellEnd"/>
     </w:p>
     <w:p>
       <w:pPr>
@@ -4190,15 +3763,7 @@
         <w:t>Item Price:</w:t>
       </w:r>
       <w:r>
-        <w:t xml:space="preserve"> The base price of the product before any discounts (e.g., 42.0 for </w:t>
-      </w:r>
-      <w:proofErr w:type="spellStart"/>
-      <w:r>
-        <w:t>Aalopuri</w:t>
-      </w:r>
-      <w:proofErr w:type="spellEnd"/>
-      <w:r>
-        <w:t>, 9.0 for Cold Coffee).</w:t>
+        <w:t xml:space="preserve"> The base price of the product before any discounts (e.g., 42.0 for Aalopuri, 9.0 for Cold Coffee).</w:t>
       </w:r>
     </w:p>
     <w:p>
@@ -4316,16 +3881,11 @@
       <w:r>
         <w:t xml:space="preserve">, with </w:t>
       </w:r>
-      <w:proofErr w:type="spellStart"/>
       <w:r>
         <w:t>payment</w:t>
       </w:r>
       <w:r>
-        <w:t>_type</w:t>
-      </w:r>
-      <w:proofErr w:type="spellEnd"/>
-      <w:r>
-        <w:t xml:space="preserve"> set to </w:t>
+        <w:t xml:space="preserve">_type set to </w:t>
       </w:r>
       <w:r>
         <w:rPr>
@@ -4357,15 +3917,7 @@
         <w:t>card payments</w:t>
       </w:r>
       <w:r>
-        <w:t xml:space="preserve">, indicated by the attribute </w:t>
-      </w:r>
-      <w:proofErr w:type="spellStart"/>
-      <w:r>
-        <w:t>payment_type</w:t>
-      </w:r>
-      <w:proofErr w:type="spellEnd"/>
-      <w:r>
-        <w:t xml:space="preserve"> with the fixed value of </w:t>
+        <w:t xml:space="preserve">, indicated by the attribute payment_type with the fixed value of </w:t>
       </w:r>
       <w:r>
         <w:rPr>
@@ -4467,15 +4019,7 @@
       </w:r>
       <w:r>
         <w:br/>
-        <w:t xml:space="preserve">The fact table is Sales Information. It contains </w:t>
-      </w:r>
-      <w:proofErr w:type="gramStart"/>
-      <w:r>
-        <w:t>the granular</w:t>
-      </w:r>
-      <w:proofErr w:type="gramEnd"/>
-      <w:r>
-        <w:t xml:space="preserve"> details of transactions, such as Order ID, Item Price, Quantity, </w:t>
+        <w:t xml:space="preserve">The fact table is Sales Information. It contains the granular details of transactions, such as Order ID, Item Price, Quantity, </w:t>
       </w:r>
       <w:r>
         <w:t>Payment</w:t>
@@ -4519,23 +4063,7 @@
           <w:b/>
           <w:bCs/>
         </w:rPr>
-        <w:t xml:space="preserve">Each record represents a single purchase made by a customer at a specific </w:t>
-      </w:r>
-      <w:proofErr w:type="gramStart"/>
-      <w:r>
-        <w:rPr>
-          <w:b/>
-          <w:bCs/>
-        </w:rPr>
-        <w:t>fast food</w:t>
-      </w:r>
-      <w:proofErr w:type="gramEnd"/>
-      <w:r>
-        <w:rPr>
-          <w:b/>
-          <w:bCs/>
-        </w:rPr>
-        <w:t xml:space="preserve"> outlet on a given date.</w:t>
+        <w:t>Each record represents a single purchase made by a customer at a specific fast food outlet on a given date.</w:t>
       </w:r>
     </w:p>
     <w:p>
@@ -4943,11 +4471,9 @@
               <w:pStyle w:val="BodyText"/>
               <w:ind w:left="360"/>
             </w:pPr>
-            <w:proofErr w:type="spellStart"/>
             <w:r>
               <w:t>Order_ID</w:t>
             </w:r>
-            <w:proofErr w:type="spellEnd"/>
           </w:p>
         </w:tc>
         <w:tc>
@@ -5081,11 +4607,9 @@
               <w:pStyle w:val="BodyText"/>
               <w:ind w:left="360"/>
             </w:pPr>
-            <w:proofErr w:type="spellStart"/>
             <w:r>
               <w:t>Prod_Price</w:t>
             </w:r>
-            <w:proofErr w:type="spellEnd"/>
           </w:p>
         </w:tc>
         <w:tc>
@@ -5128,13 +4652,8 @@
               <w:pStyle w:val="BodyText"/>
               <w:ind w:left="360"/>
             </w:pPr>
-            <w:proofErr w:type="gramStart"/>
-            <w:r>
-              <w:t>Decimal(</w:t>
-            </w:r>
-            <w:proofErr w:type="gramEnd"/>
-            <w:r>
-              <w:t>5,2)</w:t>
+            <w:r>
+              <w:t>Decimal(5,2)</w:t>
             </w:r>
           </w:p>
         </w:tc>
@@ -5232,11 +4751,9 @@
               <w:pStyle w:val="BodyText"/>
               <w:ind w:left="360"/>
             </w:pPr>
-            <w:proofErr w:type="spellStart"/>
             <w:r>
               <w:t>Payment_Amount</w:t>
             </w:r>
-            <w:proofErr w:type="spellEnd"/>
           </w:p>
         </w:tc>
         <w:tc>
@@ -5277,13 +4794,8 @@
               <w:pStyle w:val="BodyText"/>
               <w:ind w:left="360"/>
             </w:pPr>
-            <w:proofErr w:type="gramStart"/>
-            <w:r>
-              <w:t>Decimal(</w:t>
-            </w:r>
-            <w:proofErr w:type="gramEnd"/>
-            <w:r>
-              <w:t>6,2)</w:t>
+            <w:r>
+              <w:t>Decimal(6,2)</w:t>
             </w:r>
           </w:p>
         </w:tc>
@@ -5307,7 +4819,6 @@
               <w:pStyle w:val="BodyText"/>
               <w:ind w:left="360"/>
             </w:pPr>
-            <w:proofErr w:type="spellStart"/>
             <w:r>
               <w:lastRenderedPageBreak/>
               <w:t>Payment</w:t>
@@ -5318,7 +4829,6 @@
             <w:r>
               <w:t>Type</w:t>
             </w:r>
-            <w:proofErr w:type="spellEnd"/>
           </w:p>
         </w:tc>
         <w:tc>
@@ -5359,11 +4869,9 @@
               <w:pStyle w:val="BodyText"/>
               <w:ind w:left="360"/>
             </w:pPr>
-            <w:proofErr w:type="gramStart"/>
             <w:r>
               <w:t>Varchar(</w:t>
             </w:r>
-            <w:proofErr w:type="gramEnd"/>
             <w:r>
               <w:t>4)</w:t>
             </w:r>
@@ -5389,11 +4897,9 @@
               <w:pStyle w:val="BodyText"/>
               <w:ind w:left="360"/>
             </w:pPr>
-            <w:proofErr w:type="spellStart"/>
             <w:r>
               <w:t>Product_ID</w:t>
             </w:r>
-            <w:proofErr w:type="spellEnd"/>
           </w:p>
         </w:tc>
         <w:tc>
@@ -5415,13 +4921,8 @@
               <w:t>References</w:t>
             </w:r>
             <w:r>
-              <w:t xml:space="preserve"> </w:t>
-            </w:r>
-            <w:proofErr w:type="gramStart"/>
-            <w:r>
-              <w:t>to</w:t>
-            </w:r>
-            <w:proofErr w:type="gramEnd"/>
+              <w:t xml:space="preserve"> to</w:t>
+            </w:r>
             <w:r>
               <w:t xml:space="preserve"> the Product table</w:t>
             </w:r>
@@ -5445,13 +4946,8 @@
               <w:pStyle w:val="BodyText"/>
               <w:ind w:left="360"/>
             </w:pPr>
-            <w:proofErr w:type="gramStart"/>
-            <w:r>
-              <w:t>Varchar(</w:t>
-            </w:r>
-            <w:proofErr w:type="gramEnd"/>
-            <w:r>
-              <w:t>10)</w:t>
+            <w:r>
+              <w:t>Varchar(10)</w:t>
             </w:r>
           </w:p>
         </w:tc>
@@ -5475,14 +4971,12 @@
               <w:pStyle w:val="BodyText"/>
               <w:ind w:left="360"/>
             </w:pPr>
-            <w:proofErr w:type="spellStart"/>
             <w:r>
               <w:t>Point</w:t>
             </w:r>
             <w:r>
               <w:t>_ID</w:t>
             </w:r>
-            <w:proofErr w:type="spellEnd"/>
           </w:p>
         </w:tc>
         <w:tc>
@@ -5535,13 +5029,8 @@
               <w:pStyle w:val="BodyText"/>
               <w:ind w:left="360"/>
             </w:pPr>
-            <w:proofErr w:type="gramStart"/>
-            <w:r>
-              <w:t>Varchar(</w:t>
-            </w:r>
-            <w:proofErr w:type="gramEnd"/>
-            <w:r>
-              <w:t>10)</w:t>
+            <w:r>
+              <w:t>Varchar(10)</w:t>
             </w:r>
           </w:p>
         </w:tc>
@@ -5567,11 +5056,9 @@
             <w:r>
               <w:t xml:space="preserve">      </w:t>
             </w:r>
-            <w:proofErr w:type="spellStart"/>
             <w:r>
               <w:t>Discount_ID</w:t>
             </w:r>
-            <w:proofErr w:type="spellEnd"/>
           </w:p>
         </w:tc>
         <w:tc>
@@ -5618,13 +5105,8 @@
               <w:pStyle w:val="BodyText"/>
               <w:ind w:left="360"/>
             </w:pPr>
-            <w:proofErr w:type="gramStart"/>
-            <w:r>
-              <w:t>Varchar(</w:t>
-            </w:r>
-            <w:proofErr w:type="gramEnd"/>
-            <w:r>
-              <w:t>10)</w:t>
+            <w:r>
+              <w:t>Varchar(10)</w:t>
             </w:r>
           </w:p>
         </w:tc>
@@ -5648,11 +5130,9 @@
               <w:pStyle w:val="BodyText"/>
               <w:ind w:left="360"/>
             </w:pPr>
-            <w:proofErr w:type="spellStart"/>
             <w:r>
               <w:t>Customer_ID</w:t>
             </w:r>
-            <w:proofErr w:type="spellEnd"/>
           </w:p>
         </w:tc>
         <w:tc>
@@ -5699,13 +5179,8 @@
               <w:pStyle w:val="BodyText"/>
               <w:ind w:left="360"/>
             </w:pPr>
-            <w:proofErr w:type="gramStart"/>
-            <w:r>
-              <w:t>Varchar(</w:t>
-            </w:r>
-            <w:proofErr w:type="gramEnd"/>
-            <w:r>
-              <w:t>10)</w:t>
+            <w:r>
+              <w:t>Varchar(10)</w:t>
             </w:r>
           </w:p>
         </w:tc>
@@ -5729,11 +5204,9 @@
               <w:pStyle w:val="BodyText"/>
               <w:ind w:left="360"/>
             </w:pPr>
-            <w:proofErr w:type="spellStart"/>
             <w:r>
               <w:t>Employee_ID</w:t>
             </w:r>
-            <w:proofErr w:type="spellEnd"/>
           </w:p>
         </w:tc>
         <w:tc>
@@ -5780,13 +5253,8 @@
               <w:pStyle w:val="BodyText"/>
               <w:ind w:left="360"/>
             </w:pPr>
-            <w:proofErr w:type="gramStart"/>
-            <w:r>
-              <w:t>Varchar(</w:t>
-            </w:r>
-            <w:proofErr w:type="gramEnd"/>
-            <w:r>
-              <w:t>10)</w:t>
+            <w:r>
+              <w:t>Varchar(10)</w:t>
             </w:r>
           </w:p>
         </w:tc>
@@ -5810,11 +5278,9 @@
               <w:pStyle w:val="BodyText"/>
               <w:ind w:left="360"/>
             </w:pPr>
-            <w:proofErr w:type="spellStart"/>
             <w:r>
               <w:t>Card_Info_ID</w:t>
             </w:r>
-            <w:proofErr w:type="spellEnd"/>
           </w:p>
         </w:tc>
         <w:tc>
@@ -5839,15 +5305,7 @@
               <w:t xml:space="preserve">to </w:t>
             </w:r>
             <w:r>
-              <w:t xml:space="preserve">the </w:t>
-            </w:r>
-            <w:proofErr w:type="spellStart"/>
-            <w:r>
-              <w:t>Card_Info</w:t>
-            </w:r>
-            <w:proofErr w:type="spellEnd"/>
-            <w:r>
-              <w:t xml:space="preserve"> table</w:t>
+              <w:t>the Card_Info table</w:t>
             </w:r>
             <w:r>
               <w:t>, NOT NULL</w:t>
@@ -5869,13 +5327,8 @@
               <w:pStyle w:val="BodyText"/>
               <w:ind w:left="360"/>
             </w:pPr>
-            <w:proofErr w:type="gramStart"/>
-            <w:r>
-              <w:t>Varchar(</w:t>
-            </w:r>
-            <w:proofErr w:type="gramEnd"/>
-            <w:r>
-              <w:t>10)</w:t>
+            <w:r>
+              <w:t>Varchar(10)</w:t>
             </w:r>
           </w:p>
         </w:tc>
@@ -5899,11 +5352,9 @@
               <w:pStyle w:val="BodyText"/>
               <w:ind w:left="360"/>
             </w:pPr>
-            <w:proofErr w:type="spellStart"/>
             <w:r>
               <w:t>Channel_ID</w:t>
             </w:r>
-            <w:proofErr w:type="spellEnd"/>
           </w:p>
         </w:tc>
         <w:tc>
@@ -5950,13 +5401,8 @@
               <w:pStyle w:val="BodyText"/>
               <w:ind w:left="360"/>
             </w:pPr>
-            <w:proofErr w:type="gramStart"/>
-            <w:r>
-              <w:t>Varchar(</w:t>
-            </w:r>
-            <w:proofErr w:type="gramEnd"/>
-            <w:r>
-              <w:t>10)</w:t>
+            <w:r>
+              <w:t>Varchar(10)</w:t>
             </w:r>
           </w:p>
         </w:tc>
@@ -6034,11 +5480,9 @@
             <w:pPr>
               <w:pStyle w:val="BodyText"/>
             </w:pPr>
-            <w:proofErr w:type="spellStart"/>
             <w:r>
               <w:t>Order_ID</w:t>
             </w:r>
-            <w:proofErr w:type="spellEnd"/>
           </w:p>
         </w:tc>
         <w:tc>
@@ -6057,11 +5501,9 @@
             <w:pPr>
               <w:pStyle w:val="BodyText"/>
             </w:pPr>
-            <w:proofErr w:type="spellStart"/>
             <w:r>
               <w:t>Prod_Price</w:t>
             </w:r>
-            <w:proofErr w:type="spellEnd"/>
           </w:p>
         </w:tc>
         <w:tc>
@@ -6102,11 +5544,9 @@
               <w:pStyle w:val="BodyText"/>
               <w:ind w:left="360"/>
             </w:pPr>
-            <w:proofErr w:type="spellStart"/>
             <w:r>
               <w:t>Payment_Amount</w:t>
             </w:r>
-            <w:proofErr w:type="spellEnd"/>
           </w:p>
         </w:tc>
         <w:tc>
@@ -6125,7 +5565,6 @@
               <w:pStyle w:val="BodyText"/>
               <w:ind w:left="360"/>
             </w:pPr>
-            <w:proofErr w:type="spellStart"/>
             <w:r>
               <w:t>Payment</w:t>
             </w:r>
@@ -6135,7 +5574,6 @@
             <w:r>
               <w:t>Type</w:t>
             </w:r>
-            <w:proofErr w:type="spellEnd"/>
           </w:p>
         </w:tc>
       </w:tr>
@@ -6300,11 +5738,9 @@
             <w:pPr>
               <w:pStyle w:val="BodyText"/>
             </w:pPr>
-            <w:proofErr w:type="spellStart"/>
             <w:r>
               <w:t>Order_ID</w:t>
             </w:r>
-            <w:proofErr w:type="spellEnd"/>
           </w:p>
         </w:tc>
         <w:tc>
@@ -6323,11 +5759,9 @@
             <w:pPr>
               <w:pStyle w:val="BodyText"/>
             </w:pPr>
-            <w:proofErr w:type="spellStart"/>
             <w:r>
               <w:t>Prod_Price</w:t>
             </w:r>
-            <w:proofErr w:type="spellEnd"/>
           </w:p>
         </w:tc>
         <w:tc>
@@ -6368,11 +5802,9 @@
               <w:pStyle w:val="BodyText"/>
               <w:ind w:left="360"/>
             </w:pPr>
-            <w:proofErr w:type="spellStart"/>
             <w:r>
               <w:t>Payment_Amount</w:t>
             </w:r>
-            <w:proofErr w:type="spellEnd"/>
           </w:p>
         </w:tc>
         <w:tc>
@@ -6391,7 +5823,6 @@
               <w:pStyle w:val="BodyText"/>
               <w:ind w:left="360"/>
             </w:pPr>
-            <w:proofErr w:type="spellStart"/>
             <w:r>
               <w:t>Payment</w:t>
             </w:r>
@@ -6401,7 +5832,6 @@
             <w:r>
               <w:t>Type</w:t>
             </w:r>
-            <w:proofErr w:type="spellEnd"/>
           </w:p>
         </w:tc>
       </w:tr>
@@ -6771,13 +6201,8 @@
               <w:pStyle w:val="BodyText"/>
               <w:ind w:left="360"/>
             </w:pPr>
-            <w:proofErr w:type="gramStart"/>
-            <w:r>
-              <w:t>Varchar(</w:t>
-            </w:r>
-            <w:proofErr w:type="gramEnd"/>
-            <w:r>
-              <w:t>64)</w:t>
+            <w:r>
+              <w:t>Varchar(64)</w:t>
             </w:r>
           </w:p>
         </w:tc>
@@ -6801,11 +6226,9 @@
               <w:pStyle w:val="BodyText"/>
               <w:ind w:left="360"/>
             </w:pPr>
-            <w:proofErr w:type="spellStart"/>
             <w:r>
               <w:t>Category_ID</w:t>
             </w:r>
-            <w:proofErr w:type="spellEnd"/>
           </w:p>
         </w:tc>
         <w:tc>
@@ -6871,14 +6294,12 @@
               <w:pStyle w:val="BodyText"/>
               <w:ind w:left="360"/>
             </w:pPr>
-            <w:proofErr w:type="spellStart"/>
             <w:r>
               <w:t>Category_</w:t>
             </w:r>
             <w:r>
               <w:t>Name</w:t>
             </w:r>
-            <w:proofErr w:type="spellEnd"/>
           </w:p>
         </w:tc>
         <w:tc>
@@ -6919,13 +6340,8 @@
               <w:pStyle w:val="BodyText"/>
               <w:ind w:left="360"/>
             </w:pPr>
-            <w:proofErr w:type="gramStart"/>
-            <w:r>
-              <w:t>Varchar(</w:t>
-            </w:r>
-            <w:proofErr w:type="gramEnd"/>
-            <w:r>
-              <w:t>64)</w:t>
+            <w:r>
+              <w:t>Varchar(64)</w:t>
             </w:r>
           </w:p>
         </w:tc>
@@ -7038,11 +6454,9 @@
               <w:pStyle w:val="BodyText"/>
               <w:ind w:left="360"/>
             </w:pPr>
-            <w:proofErr w:type="spellStart"/>
             <w:r>
               <w:t>Category_ID</w:t>
             </w:r>
-            <w:proofErr w:type="spellEnd"/>
           </w:p>
         </w:tc>
         <w:tc>
@@ -7062,16 +6476,11 @@
               <w:pStyle w:val="BodyText"/>
               <w:ind w:left="360"/>
             </w:pPr>
-            <w:proofErr w:type="spellStart"/>
             <w:r>
               <w:t>Category_N</w:t>
             </w:r>
             <w:r>
-              <w:t>ame</w:t>
-            </w:r>
-            <w:proofErr w:type="spellEnd"/>
-            <w:r>
-              <w:t xml:space="preserve"> </w:t>
+              <w:t xml:space="preserve">ame </w:t>
             </w:r>
           </w:p>
         </w:tc>
@@ -7159,11 +6568,9 @@
               <w:pStyle w:val="BodyText"/>
               <w:ind w:left="360"/>
             </w:pPr>
-            <w:proofErr w:type="spellStart"/>
             <w:r>
               <w:t>Fastfood</w:t>
             </w:r>
-            <w:proofErr w:type="spellEnd"/>
           </w:p>
         </w:tc>
       </w:tr>
@@ -7308,11 +6715,9 @@
               <w:pStyle w:val="BodyText"/>
               <w:ind w:left="360"/>
             </w:pPr>
-            <w:proofErr w:type="spellStart"/>
             <w:r>
               <w:t>Date_ID</w:t>
             </w:r>
-            <w:proofErr w:type="spellEnd"/>
           </w:p>
         </w:tc>
         <w:tc>
@@ -7381,11 +6786,9 @@
               <w:pStyle w:val="BodyText"/>
               <w:ind w:left="360"/>
             </w:pPr>
-            <w:proofErr w:type="spellStart"/>
             <w:r>
               <w:t>Day_of_week</w:t>
             </w:r>
-            <w:proofErr w:type="spellEnd"/>
           </w:p>
         </w:tc>
         <w:tc>
@@ -7425,13 +6828,8 @@
               <w:pStyle w:val="BodyText"/>
               <w:ind w:left="360"/>
             </w:pPr>
-            <w:proofErr w:type="gramStart"/>
-            <w:r>
-              <w:t>Varchar(</w:t>
-            </w:r>
-            <w:proofErr w:type="gramEnd"/>
-            <w:r>
-              <w:t>64)</w:t>
+            <w:r>
+              <w:t>Varchar(64)</w:t>
             </w:r>
           </w:p>
         </w:tc>
@@ -7495,13 +6893,8 @@
               <w:pStyle w:val="BodyText"/>
               <w:ind w:left="360"/>
             </w:pPr>
-            <w:proofErr w:type="gramStart"/>
-            <w:r>
-              <w:t>Varchar(</w:t>
-            </w:r>
-            <w:proofErr w:type="gramEnd"/>
-            <w:r>
-              <w:t>64)</w:t>
+            <w:r>
+              <w:t>Varchar(64)</w:t>
             </w:r>
           </w:p>
         </w:tc>
@@ -7590,11 +6983,9 @@
               <w:pStyle w:val="BodyText"/>
               <w:ind w:left="360"/>
             </w:pPr>
-            <w:proofErr w:type="spellStart"/>
             <w:r>
               <w:t>Qaurter</w:t>
             </w:r>
-            <w:proofErr w:type="spellEnd"/>
           </w:p>
         </w:tc>
         <w:tc>
@@ -7769,11 +7160,9 @@
               <w:pStyle w:val="BodyText"/>
               <w:ind w:left="360"/>
             </w:pPr>
-            <w:proofErr w:type="spellStart"/>
             <w:r>
               <w:t>Date_ID</w:t>
             </w:r>
-            <w:proofErr w:type="spellEnd"/>
           </w:p>
         </w:tc>
         <w:tc>
@@ -8164,11 +7553,9 @@
               <w:pStyle w:val="BodyText"/>
               <w:ind w:left="360"/>
             </w:pPr>
-            <w:proofErr w:type="spellStart"/>
             <w:r>
               <w:t>Cust_ID</w:t>
             </w:r>
-            <w:proofErr w:type="spellEnd"/>
           </w:p>
         </w:tc>
         <w:tc>
@@ -8237,11 +7624,9 @@
               <w:pStyle w:val="BodyText"/>
               <w:ind w:left="360"/>
             </w:pPr>
-            <w:proofErr w:type="spellStart"/>
             <w:r>
               <w:t>Cust_First_Name</w:t>
             </w:r>
-            <w:proofErr w:type="spellEnd"/>
           </w:p>
         </w:tc>
         <w:tc>
@@ -8284,13 +7669,8 @@
               <w:pStyle w:val="BodyText"/>
               <w:ind w:left="360"/>
             </w:pPr>
-            <w:proofErr w:type="gramStart"/>
-            <w:r>
-              <w:t>Varchar(</w:t>
-            </w:r>
-            <w:proofErr w:type="gramEnd"/>
-            <w:r>
-              <w:t>64)</w:t>
+            <w:r>
+              <w:t>Varchar(64)</w:t>
             </w:r>
           </w:p>
         </w:tc>
@@ -8314,11 +7694,9 @@
               <w:pStyle w:val="BodyText"/>
               <w:ind w:left="360"/>
             </w:pPr>
-            <w:proofErr w:type="spellStart"/>
             <w:r>
               <w:t>Cust_Last_Name</w:t>
             </w:r>
-            <w:proofErr w:type="spellEnd"/>
           </w:p>
         </w:tc>
         <w:tc>
@@ -8365,13 +7743,8 @@
               <w:pStyle w:val="BodyText"/>
               <w:ind w:left="360"/>
             </w:pPr>
-            <w:proofErr w:type="gramStart"/>
-            <w:r>
-              <w:t>Varchar(</w:t>
-            </w:r>
-            <w:proofErr w:type="gramEnd"/>
-            <w:r>
-              <w:t>64)</w:t>
+            <w:r>
+              <w:t>Varchar(64)</w:t>
             </w:r>
           </w:p>
         </w:tc>
@@ -8395,11 +7768,9 @@
               <w:pStyle w:val="BodyText"/>
               <w:ind w:left="360"/>
             </w:pPr>
-            <w:proofErr w:type="spellStart"/>
             <w:r>
               <w:t>Cust_phone_number</w:t>
             </w:r>
-            <w:proofErr w:type="spellEnd"/>
           </w:p>
         </w:tc>
         <w:tc>
@@ -8440,13 +7811,8 @@
               <w:pStyle w:val="BodyText"/>
               <w:ind w:left="360"/>
             </w:pPr>
-            <w:proofErr w:type="gramStart"/>
-            <w:r>
-              <w:t>Varchar(</w:t>
-            </w:r>
-            <w:proofErr w:type="gramEnd"/>
-            <w:r>
-              <w:t>20)</w:t>
+            <w:r>
+              <w:t>Varchar(20)</w:t>
             </w:r>
           </w:p>
         </w:tc>
@@ -8515,11 +7881,9 @@
               <w:pStyle w:val="BodyText"/>
               <w:ind w:left="360"/>
             </w:pPr>
-            <w:proofErr w:type="spellStart"/>
             <w:r>
               <w:t>Cust_ID</w:t>
             </w:r>
-            <w:proofErr w:type="spellEnd"/>
           </w:p>
         </w:tc>
         <w:tc>
@@ -8539,11 +7903,9 @@
               <w:pStyle w:val="BodyText"/>
               <w:ind w:left="360"/>
             </w:pPr>
-            <w:proofErr w:type="spellStart"/>
             <w:r>
               <w:t>Cust_First_Name</w:t>
             </w:r>
-            <w:proofErr w:type="spellEnd"/>
           </w:p>
         </w:tc>
         <w:tc>
@@ -8563,11 +7925,9 @@
               <w:pStyle w:val="BodyText"/>
               <w:ind w:left="360"/>
             </w:pPr>
-            <w:proofErr w:type="spellStart"/>
             <w:r>
               <w:t>Cust_First_Name</w:t>
             </w:r>
-            <w:proofErr w:type="spellEnd"/>
           </w:p>
         </w:tc>
         <w:tc>
@@ -8586,11 +7946,9 @@
               <w:pStyle w:val="BodyText"/>
               <w:ind w:left="360"/>
             </w:pPr>
-            <w:proofErr w:type="spellStart"/>
             <w:r>
               <w:t>Cust_Phone_Number</w:t>
             </w:r>
-            <w:proofErr w:type="spellEnd"/>
           </w:p>
         </w:tc>
       </w:tr>
@@ -8886,11 +8244,9 @@
               <w:pStyle w:val="BodyText"/>
               <w:ind w:left="360"/>
             </w:pPr>
-            <w:proofErr w:type="spellStart"/>
             <w:r>
               <w:t>EMP_First_Name</w:t>
             </w:r>
-            <w:proofErr w:type="spellEnd"/>
           </w:p>
         </w:tc>
         <w:tc>
@@ -8936,13 +8292,8 @@
               <w:pStyle w:val="BodyText"/>
               <w:ind w:left="360"/>
             </w:pPr>
-            <w:proofErr w:type="gramStart"/>
-            <w:r>
-              <w:t>Varchar(</w:t>
-            </w:r>
-            <w:proofErr w:type="gramEnd"/>
-            <w:r>
-              <w:t>64)</w:t>
+            <w:r>
+              <w:t>Varchar(64)</w:t>
             </w:r>
           </w:p>
         </w:tc>
@@ -8966,11 +8317,9 @@
               <w:pStyle w:val="BodyText"/>
               <w:ind w:left="360"/>
             </w:pPr>
-            <w:proofErr w:type="spellStart"/>
             <w:r>
               <w:t>EMP_Last_Name</w:t>
             </w:r>
-            <w:proofErr w:type="spellEnd"/>
           </w:p>
         </w:tc>
         <w:tc>
@@ -9020,13 +8369,8 @@
               <w:pStyle w:val="BodyText"/>
               <w:ind w:left="360"/>
             </w:pPr>
-            <w:proofErr w:type="gramStart"/>
-            <w:r>
-              <w:t>Varchar(</w:t>
-            </w:r>
-            <w:proofErr w:type="gramEnd"/>
-            <w:r>
-              <w:t>64)</w:t>
+            <w:r>
+              <w:t>Varchar(64)</w:t>
             </w:r>
           </w:p>
         </w:tc>
@@ -9115,11 +8459,9 @@
               <w:pStyle w:val="BodyText"/>
               <w:ind w:left="360"/>
             </w:pPr>
-            <w:proofErr w:type="spellStart"/>
             <w:r>
               <w:t>EMP_Personal_ID</w:t>
             </w:r>
-            <w:proofErr w:type="spellEnd"/>
           </w:p>
         </w:tc>
         <w:tc>
@@ -9138,23 +8480,7 @@
               <w:ind w:left="360"/>
             </w:pPr>
             <w:r>
-              <w:t xml:space="preserve">Unique </w:t>
-            </w:r>
-            <w:proofErr w:type="spellStart"/>
-            <w:r>
-              <w:t>pesronal</w:t>
-            </w:r>
-            <w:proofErr w:type="spellEnd"/>
-            <w:r>
-              <w:t xml:space="preserve"> identifier of employee, </w:t>
-            </w:r>
-            <w:proofErr w:type="gramStart"/>
-            <w:r>
-              <w:t>NON NULL</w:t>
-            </w:r>
-            <w:proofErr w:type="gramEnd"/>
-            <w:r>
-              <w:t xml:space="preserve"> UNIQUE</w:t>
+              <w:t>Unique pesronal identifier of employee, NON NULL UNIQUE</w:t>
             </w:r>
           </w:p>
         </w:tc>
@@ -9173,13 +8499,8 @@
               <w:pStyle w:val="BodyText"/>
               <w:ind w:left="360"/>
             </w:pPr>
-            <w:proofErr w:type="gramStart"/>
-            <w:r>
-              <w:t>Varchar(</w:t>
-            </w:r>
-            <w:proofErr w:type="gramEnd"/>
-            <w:r>
-              <w:t>12)</w:t>
+            <w:r>
+              <w:t>Varchar(12)</w:t>
             </w:r>
           </w:p>
         </w:tc>
@@ -9203,11 +8524,9 @@
               <w:pStyle w:val="BodyText"/>
               <w:ind w:left="360"/>
             </w:pPr>
-            <w:proofErr w:type="spellStart"/>
             <w:r>
               <w:t>Emp_Phone_Number</w:t>
             </w:r>
-            <w:proofErr w:type="spellEnd"/>
           </w:p>
         </w:tc>
         <w:tc>
@@ -9257,13 +8576,8 @@
               <w:pStyle w:val="BodyText"/>
               <w:ind w:left="360"/>
             </w:pPr>
-            <w:proofErr w:type="gramStart"/>
-            <w:r>
-              <w:t>Varchar(</w:t>
-            </w:r>
-            <w:proofErr w:type="gramEnd"/>
-            <w:r>
-              <w:t>20)</w:t>
+            <w:r>
+              <w:t>Varchar(20)</w:t>
             </w:r>
           </w:p>
         </w:tc>
@@ -9357,11 +8671,9 @@
             <w:pPr>
               <w:pStyle w:val="BodyText"/>
             </w:pPr>
-            <w:proofErr w:type="spellStart"/>
             <w:r>
               <w:t>EMP_First_Name</w:t>
             </w:r>
-            <w:proofErr w:type="spellEnd"/>
           </w:p>
         </w:tc>
         <w:tc>
@@ -9380,11 +8692,9 @@
             <w:pPr>
               <w:pStyle w:val="BodyText"/>
             </w:pPr>
-            <w:proofErr w:type="spellStart"/>
             <w:r>
               <w:t>EMP_First_Name</w:t>
             </w:r>
-            <w:proofErr w:type="spellEnd"/>
           </w:p>
         </w:tc>
         <w:tc>
@@ -9423,11 +8733,9 @@
             <w:pPr>
               <w:pStyle w:val="BodyText"/>
             </w:pPr>
-            <w:proofErr w:type="spellStart"/>
             <w:r>
               <w:t>EMP_Pers_ID</w:t>
             </w:r>
-            <w:proofErr w:type="spellEnd"/>
           </w:p>
         </w:tc>
         <w:tc>
@@ -9445,11 +8753,9 @@
             <w:pPr>
               <w:pStyle w:val="BodyText"/>
             </w:pPr>
-            <w:proofErr w:type="spellStart"/>
             <w:r>
               <w:t>Cust_Phone_Number</w:t>
             </w:r>
-            <w:proofErr w:type="spellEnd"/>
           </w:p>
         </w:tc>
       </w:tr>
@@ -9756,11 +9062,9 @@
               <w:pStyle w:val="BodyText"/>
               <w:ind w:left="360"/>
             </w:pPr>
-            <w:proofErr w:type="spellStart"/>
             <w:r>
               <w:t>Point_ID</w:t>
             </w:r>
-            <w:proofErr w:type="spellEnd"/>
           </w:p>
         </w:tc>
         <w:tc>
@@ -9829,14 +9133,12 @@
               <w:pStyle w:val="BodyText"/>
               <w:ind w:left="360"/>
             </w:pPr>
-            <w:proofErr w:type="spellStart"/>
             <w:r>
               <w:t>Point_</w:t>
             </w:r>
             <w:r>
               <w:t>Name</w:t>
             </w:r>
-            <w:proofErr w:type="spellEnd"/>
           </w:p>
         </w:tc>
         <w:tc>
@@ -9879,13 +9181,8 @@
               <w:pStyle w:val="BodyText"/>
               <w:ind w:left="360"/>
             </w:pPr>
-            <w:proofErr w:type="gramStart"/>
-            <w:r>
-              <w:t>Varchar(</w:t>
-            </w:r>
-            <w:proofErr w:type="gramEnd"/>
-            <w:r>
-              <w:t>64)</w:t>
+            <w:r>
+              <w:t>Varchar(64)</w:t>
             </w:r>
           </w:p>
         </w:tc>
@@ -9909,11 +9206,9 @@
               <w:pStyle w:val="BodyText"/>
               <w:ind w:left="360"/>
             </w:pPr>
-            <w:proofErr w:type="spellStart"/>
             <w:r>
               <w:t>Address_ID</w:t>
             </w:r>
-            <w:proofErr w:type="spellEnd"/>
           </w:p>
         </w:tc>
         <w:tc>
@@ -10019,13 +9314,8 @@
               <w:pStyle w:val="BodyText"/>
               <w:ind w:left="360"/>
             </w:pPr>
-            <w:proofErr w:type="gramStart"/>
-            <w:r>
-              <w:t>Varchar(</w:t>
-            </w:r>
-            <w:proofErr w:type="gramEnd"/>
-            <w:r>
-              <w:t>64)</w:t>
+            <w:r>
+              <w:t>Varchar(64)</w:t>
             </w:r>
           </w:p>
         </w:tc>
@@ -10049,11 +9339,9 @@
               <w:pStyle w:val="BodyText"/>
               <w:ind w:left="360"/>
             </w:pPr>
-            <w:proofErr w:type="spellStart"/>
             <w:r>
               <w:t>City_ID</w:t>
             </w:r>
-            <w:proofErr w:type="spellEnd"/>
           </w:p>
         </w:tc>
         <w:tc>
@@ -10128,11 +9416,9 @@
               <w:pStyle w:val="BodyText"/>
               <w:ind w:left="360"/>
             </w:pPr>
-            <w:proofErr w:type="spellStart"/>
             <w:r>
               <w:t>City_Name</w:t>
             </w:r>
-            <w:proofErr w:type="spellEnd"/>
           </w:p>
         </w:tc>
         <w:tc>
@@ -10170,13 +9456,8 @@
               <w:pStyle w:val="BodyText"/>
               <w:ind w:left="360"/>
             </w:pPr>
-            <w:proofErr w:type="gramStart"/>
-            <w:r>
-              <w:t>Varchar(</w:t>
-            </w:r>
-            <w:proofErr w:type="gramEnd"/>
-            <w:r>
-              <w:t>64)</w:t>
+            <w:r>
+              <w:t>Varchar(64)</w:t>
             </w:r>
           </w:p>
         </w:tc>
@@ -10200,11 +9481,9 @@
               <w:pStyle w:val="BodyText"/>
               <w:ind w:left="360"/>
             </w:pPr>
-            <w:proofErr w:type="spellStart"/>
             <w:r>
               <w:t>Country_ID</w:t>
             </w:r>
-            <w:proofErr w:type="spellEnd"/>
           </w:p>
         </w:tc>
         <w:tc>
@@ -10273,11 +9552,9 @@
               <w:pStyle w:val="BodyText"/>
               <w:ind w:left="360"/>
             </w:pPr>
-            <w:proofErr w:type="spellStart"/>
             <w:r>
               <w:t>Country_Name</w:t>
             </w:r>
-            <w:proofErr w:type="spellEnd"/>
           </w:p>
         </w:tc>
         <w:tc>
@@ -10315,13 +9592,8 @@
               <w:pStyle w:val="BodyText"/>
               <w:ind w:left="360"/>
             </w:pPr>
-            <w:proofErr w:type="gramStart"/>
-            <w:r>
-              <w:t>Varchar(</w:t>
-            </w:r>
-            <w:proofErr w:type="gramEnd"/>
-            <w:r>
-              <w:t>64)</w:t>
+            <w:r>
+              <w:t>Varchar(64)</w:t>
             </w:r>
           </w:p>
         </w:tc>
@@ -10390,11 +9662,9 @@
               <w:pStyle w:val="BodyText"/>
               <w:ind w:left="360"/>
             </w:pPr>
-            <w:proofErr w:type="spellStart"/>
             <w:r>
               <w:t>Point_ID</w:t>
             </w:r>
-            <w:proofErr w:type="spellEnd"/>
           </w:p>
         </w:tc>
         <w:tc>
@@ -10414,11 +9684,9 @@
               <w:pStyle w:val="BodyText"/>
               <w:ind w:left="360"/>
             </w:pPr>
-            <w:proofErr w:type="spellStart"/>
             <w:r>
               <w:t>Point_Name</w:t>
             </w:r>
-            <w:proofErr w:type="spellEnd"/>
           </w:p>
         </w:tc>
         <w:tc>
@@ -10438,11 +9706,9 @@
               <w:pStyle w:val="BodyText"/>
               <w:ind w:left="360"/>
             </w:pPr>
-            <w:proofErr w:type="spellStart"/>
             <w:r>
               <w:t>Address_ID</w:t>
             </w:r>
-            <w:proofErr w:type="spellEnd"/>
           </w:p>
         </w:tc>
         <w:tc>
@@ -10609,11 +9875,9 @@
               <w:pStyle w:val="BodyText"/>
               <w:ind w:left="360"/>
             </w:pPr>
-            <w:proofErr w:type="spellStart"/>
             <w:r>
               <w:t>City_ID</w:t>
             </w:r>
-            <w:proofErr w:type="spellEnd"/>
           </w:p>
         </w:tc>
         <w:tc>
@@ -10633,11 +9897,9 @@
               <w:pStyle w:val="BodyText"/>
               <w:ind w:left="360"/>
             </w:pPr>
-            <w:proofErr w:type="spellStart"/>
             <w:r>
               <w:t>City_Name</w:t>
             </w:r>
-            <w:proofErr w:type="spellEnd"/>
           </w:p>
         </w:tc>
         <w:tc>
@@ -10657,11 +9919,9 @@
               <w:pStyle w:val="BodyText"/>
               <w:ind w:left="360"/>
             </w:pPr>
-            <w:proofErr w:type="spellStart"/>
             <w:r>
               <w:t>Country_ID</w:t>
             </w:r>
-            <w:proofErr w:type="spellEnd"/>
           </w:p>
         </w:tc>
         <w:tc>
@@ -10681,11 +9941,9 @@
               <w:pStyle w:val="BodyText"/>
               <w:ind w:left="360"/>
             </w:pPr>
-            <w:proofErr w:type="spellStart"/>
             <w:r>
               <w:t>Country_Name</w:t>
             </w:r>
-            <w:proofErr w:type="spellEnd"/>
             <w:r>
               <w:t xml:space="preserve"> </w:t>
             </w:r>
@@ -10935,11 +10193,9 @@
               <w:pStyle w:val="BodyText"/>
               <w:ind w:left="360"/>
             </w:pPr>
-            <w:proofErr w:type="spellStart"/>
             <w:r>
               <w:t>Discount_ID</w:t>
             </w:r>
-            <w:proofErr w:type="spellEnd"/>
           </w:p>
         </w:tc>
         <w:tc>
@@ -11008,7 +10264,6 @@
               <w:pStyle w:val="BodyText"/>
               <w:ind w:left="360"/>
             </w:pPr>
-            <w:proofErr w:type="spellStart"/>
             <w:r>
               <w:t>Discount_</w:t>
             </w:r>
@@ -11018,7 +10273,6 @@
             <w:r>
               <w:t>ercentage</w:t>
             </w:r>
-            <w:proofErr w:type="spellEnd"/>
           </w:p>
         </w:tc>
         <w:tc>
@@ -11058,13 +10312,8 @@
               <w:pStyle w:val="BodyText"/>
               <w:ind w:left="360"/>
             </w:pPr>
-            <w:proofErr w:type="gramStart"/>
-            <w:r>
-              <w:t>Decimal(</w:t>
-            </w:r>
-            <w:proofErr w:type="gramEnd"/>
-            <w:r>
-              <w:t>2,2)</w:t>
+            <w:r>
+              <w:t>Decimal(2,2)</w:t>
             </w:r>
           </w:p>
         </w:tc>
@@ -11088,14 +10337,12 @@
               <w:pStyle w:val="BodyText"/>
               <w:ind w:left="360"/>
             </w:pPr>
-            <w:proofErr w:type="spellStart"/>
             <w:r>
               <w:t>Discount_</w:t>
             </w:r>
             <w:r>
               <w:t>Date</w:t>
             </w:r>
-            <w:proofErr w:type="spellEnd"/>
           </w:p>
         </w:tc>
         <w:tc>
@@ -11203,11 +10450,9 @@
               <w:pStyle w:val="BodyText"/>
               <w:ind w:left="360"/>
             </w:pPr>
-            <w:proofErr w:type="spellStart"/>
             <w:r>
               <w:t>Discount_ID</w:t>
             </w:r>
-            <w:proofErr w:type="spellEnd"/>
           </w:p>
         </w:tc>
         <w:tc>
@@ -11228,7 +10473,6 @@
               <w:pStyle w:val="BodyText"/>
               <w:ind w:left="360"/>
             </w:pPr>
-            <w:proofErr w:type="spellStart"/>
             <w:r>
               <w:t>Discount_</w:t>
             </w:r>
@@ -11238,7 +10482,6 @@
             <w:r>
               <w:t>ercentage</w:t>
             </w:r>
-            <w:proofErr w:type="spellEnd"/>
           </w:p>
         </w:tc>
         <w:tc>
@@ -11258,11 +10501,9 @@
               <w:pStyle w:val="BodyText"/>
               <w:ind w:left="360"/>
             </w:pPr>
-            <w:proofErr w:type="spellStart"/>
             <w:r>
               <w:t>Discount_Date</w:t>
             </w:r>
-            <w:proofErr w:type="spellEnd"/>
           </w:p>
         </w:tc>
       </w:tr>
@@ -11481,11 +10722,9 @@
               <w:pStyle w:val="BodyText"/>
               <w:ind w:left="360"/>
             </w:pPr>
-            <w:proofErr w:type="spellStart"/>
             <w:r>
               <w:t>Card_Info_ID</w:t>
             </w:r>
-            <w:proofErr w:type="spellEnd"/>
           </w:p>
         </w:tc>
         <w:tc>
@@ -11556,11 +10795,9 @@
               <w:pStyle w:val="BodyText"/>
               <w:ind w:left="360"/>
             </w:pPr>
-            <w:proofErr w:type="spellStart"/>
             <w:r>
               <w:t>Bank_ID</w:t>
             </w:r>
-            <w:proofErr w:type="spellEnd"/>
           </w:p>
         </w:tc>
         <w:tc>
@@ -11630,11 +10867,9 @@
               <w:pStyle w:val="BodyText"/>
               <w:ind w:left="360"/>
             </w:pPr>
-            <w:proofErr w:type="spellStart"/>
             <w:r>
               <w:t>Bank_Name</w:t>
             </w:r>
-            <w:proofErr w:type="spellEnd"/>
           </w:p>
         </w:tc>
         <w:tc>
@@ -11674,13 +10909,8 @@
               <w:pStyle w:val="BodyText"/>
               <w:ind w:left="360"/>
             </w:pPr>
-            <w:proofErr w:type="gramStart"/>
-            <w:r>
-              <w:t>Varchar(</w:t>
-            </w:r>
-            <w:proofErr w:type="gramEnd"/>
-            <w:r>
-              <w:t>64)</w:t>
+            <w:r>
+              <w:t>Varchar(64)</w:t>
             </w:r>
           </w:p>
         </w:tc>
@@ -11704,11 +10934,9 @@
               <w:pStyle w:val="BodyText"/>
               <w:ind w:left="360"/>
             </w:pPr>
-            <w:proofErr w:type="spellStart"/>
             <w:r>
               <w:t>Card_Type_ID</w:t>
             </w:r>
-            <w:proofErr w:type="spellEnd"/>
           </w:p>
         </w:tc>
         <w:tc>
@@ -11777,11 +11005,9 @@
               <w:pStyle w:val="BodyText"/>
               <w:ind w:left="360"/>
             </w:pPr>
-            <w:proofErr w:type="spellStart"/>
             <w:r>
               <w:t>Card_Type</w:t>
             </w:r>
-            <w:proofErr w:type="spellEnd"/>
           </w:p>
         </w:tc>
         <w:tc>
@@ -11822,13 +11048,8 @@
               <w:pStyle w:val="BodyText"/>
               <w:ind w:left="360"/>
             </w:pPr>
-            <w:proofErr w:type="gramStart"/>
-            <w:r>
-              <w:t>Varchar(</w:t>
-            </w:r>
-            <w:proofErr w:type="gramEnd"/>
-            <w:r>
-              <w:t>20)</w:t>
+            <w:r>
+              <w:t>Varchar(20)</w:t>
             </w:r>
           </w:p>
         </w:tc>
@@ -11897,11 +11118,9 @@
             <w:pPr>
               <w:pStyle w:val="BodyText"/>
             </w:pPr>
-            <w:proofErr w:type="spellStart"/>
             <w:r>
               <w:t>Card_Info_ID</w:t>
             </w:r>
-            <w:proofErr w:type="spellEnd"/>
           </w:p>
         </w:tc>
         <w:tc>
@@ -11921,11 +11140,9 @@
               <w:pStyle w:val="BodyText"/>
               <w:ind w:left="360"/>
             </w:pPr>
-            <w:proofErr w:type="spellStart"/>
             <w:r>
               <w:t>Bank_ID</w:t>
             </w:r>
-            <w:proofErr w:type="spellEnd"/>
           </w:p>
         </w:tc>
         <w:tc>
@@ -11945,11 +11162,9 @@
               <w:pStyle w:val="BodyText"/>
               <w:ind w:left="360"/>
             </w:pPr>
-            <w:proofErr w:type="spellStart"/>
             <w:r>
               <w:t>Bank_Name</w:t>
             </w:r>
-            <w:proofErr w:type="spellEnd"/>
           </w:p>
         </w:tc>
         <w:tc>
@@ -11967,11 +11182,9 @@
             <w:pPr>
               <w:pStyle w:val="BodyText"/>
             </w:pPr>
-            <w:proofErr w:type="spellStart"/>
             <w:r>
               <w:t>Card_Type_ID</w:t>
             </w:r>
-            <w:proofErr w:type="spellEnd"/>
           </w:p>
         </w:tc>
         <w:tc>
@@ -11990,11 +11203,9 @@
               <w:pStyle w:val="BodyText"/>
               <w:ind w:left="360"/>
             </w:pPr>
-            <w:proofErr w:type="spellStart"/>
             <w:r>
               <w:t>Card_Type</w:t>
             </w:r>
-            <w:proofErr w:type="spellEnd"/>
           </w:p>
         </w:tc>
       </w:tr>
@@ -12251,11 +11462,9 @@
               <w:pStyle w:val="BodyText"/>
               <w:ind w:left="360"/>
             </w:pPr>
-            <w:proofErr w:type="spellStart"/>
             <w:r>
               <w:t>Channel_ID</w:t>
             </w:r>
-            <w:proofErr w:type="spellEnd"/>
           </w:p>
         </w:tc>
         <w:tc>
@@ -12324,11 +11533,9 @@
               <w:pStyle w:val="BodyText"/>
               <w:ind w:left="360"/>
             </w:pPr>
-            <w:proofErr w:type="spellStart"/>
             <w:r>
               <w:t>Channel_Name</w:t>
             </w:r>
-            <w:proofErr w:type="spellEnd"/>
           </w:p>
         </w:tc>
         <w:tc>
@@ -12368,13 +11575,8 @@
               <w:pStyle w:val="BodyText"/>
               <w:ind w:left="360"/>
             </w:pPr>
-            <w:proofErr w:type="gramStart"/>
-            <w:r>
-              <w:t>Varchar(</w:t>
-            </w:r>
-            <w:proofErr w:type="gramEnd"/>
-            <w:r>
-              <w:t>30)</w:t>
+            <w:r>
+              <w:t>Varchar(30)</w:t>
             </w:r>
           </w:p>
         </w:tc>
@@ -12398,11 +11600,9 @@
               <w:pStyle w:val="BodyText"/>
               <w:ind w:left="360"/>
             </w:pPr>
-            <w:proofErr w:type="spellStart"/>
             <w:r>
               <w:t>Channel_Desc</w:t>
             </w:r>
-            <w:proofErr w:type="spellEnd"/>
           </w:p>
         </w:tc>
         <w:tc>
@@ -12510,11 +11710,9 @@
               <w:pStyle w:val="BodyText"/>
               <w:ind w:left="360"/>
             </w:pPr>
-            <w:proofErr w:type="spellStart"/>
             <w:r>
               <w:t>Channel_ID</w:t>
             </w:r>
-            <w:proofErr w:type="spellEnd"/>
           </w:p>
         </w:tc>
         <w:tc>
@@ -12535,11 +11733,9 @@
               <w:pStyle w:val="BodyText"/>
               <w:ind w:left="360"/>
             </w:pPr>
-            <w:proofErr w:type="spellStart"/>
             <w:r>
               <w:t>Chanel_Name</w:t>
             </w:r>
-            <w:proofErr w:type="spellEnd"/>
           </w:p>
         </w:tc>
         <w:tc>
@@ -12559,11 +11755,9 @@
               <w:pStyle w:val="BodyText"/>
               <w:ind w:left="360"/>
             </w:pPr>
-            <w:proofErr w:type="spellStart"/>
             <w:r>
               <w:t>Channel_Desc</w:t>
             </w:r>
-            <w:proofErr w:type="spellEnd"/>
           </w:p>
         </w:tc>
       </w:tr>
@@ -12857,17 +12051,17 @@
     </w:p>
     <w:p>
       <w:pPr>
-        <w:pStyle w:val="BodyText"/>
+        <w:pStyle w:val="NormalWeb"/>
       </w:pPr>
       <w:r>
         <w:rPr>
           <w:noProof/>
         </w:rPr>
         <w:drawing>
-          <wp:inline distT="0" distB="0" distL="0" distR="0" wp14:anchorId="6B2761A6" wp14:editId="63425CB8">
-            <wp:extent cx="5939790" cy="5136515"/>
-            <wp:effectExtent l="0" t="0" r="3810" b="6985"/>
-            <wp:docPr id="132360016" name="Picture 4"/>
+          <wp:inline distT="0" distB="0" distL="0" distR="0" wp14:anchorId="1C8F2817" wp14:editId="6E395AA1">
+            <wp:extent cx="5941695" cy="5008245"/>
+            <wp:effectExtent l="0" t="0" r="1905" b="1905"/>
+            <wp:docPr id="1665992006" name="Picture 4"/>
             <wp:cNvGraphicFramePr>
               <a:graphicFrameLocks xmlns:a="http://schemas.openxmlformats.org/drawingml/2006/main" noChangeAspect="1"/>
             </wp:cNvGraphicFramePr>
@@ -12896,7 +12090,7 @@
                   <pic:spPr bwMode="auto">
                     <a:xfrm>
                       <a:off x="0" y="0"/>
-                      <a:ext cx="5939790" cy="5136515"/>
+                      <a:ext cx="5941695" cy="5008245"/>
                     </a:xfrm>
                     <a:prstGeom prst="rect">
                       <a:avLst/>
@@ -12917,6 +12111,11 @@
       <w:pPr>
         <w:pStyle w:val="BodyText"/>
       </w:pPr>
+    </w:p>
+    <w:p>
+      <w:pPr>
+        <w:pStyle w:val="BodyText"/>
+      </w:pPr>
       <w:r>
         <w:t>Design process:</w:t>
       </w:r>
@@ -12979,15 +12178,7 @@
         <w:t>tructure tables, enforce constraints, add surrogate keys, and implement SCD2 attributes</w:t>
       </w:r>
       <w:r>
-        <w:t xml:space="preserve"> (</w:t>
-      </w:r>
-      <w:proofErr w:type="spellStart"/>
-      <w:r>
-        <w:t>CE_Poducts_SCD</w:t>
-      </w:r>
-      <w:proofErr w:type="spellEnd"/>
-      <w:r>
-        <w:t>)</w:t>
+        <w:t xml:space="preserve"> (CE_Poducts_SCD)</w:t>
       </w:r>
     </w:p>
     <w:p>
@@ -13022,6 +12213,7 @@
       <w:bookmarkStart w:id="23" w:name="_Toc155614193"/>
       <w:bookmarkEnd w:id="21"/>
       <w:r>
+        <w:lastRenderedPageBreak/>
         <w:t>Business Layer Dimensional Model</w:t>
       </w:r>
       <w:bookmarkEnd w:id="23"/>
@@ -21639,6 +20831,22 @@
       <w:sz w:val="24"/>
     </w:rPr>
   </w:style>
+  <w:style w:type="paragraph" w:styleId="NormalWeb">
+    <w:name w:val="Normal (Web)"/>
+    <w:basedOn w:val="Normal"/>
+    <w:uiPriority w:val="99"/>
+    <w:semiHidden/>
+    <w:unhideWhenUsed/>
+    <w:rsid w:val="001074A1"/>
+    <w:pPr>
+      <w:widowControl/>
+      <w:spacing w:before="100" w:beforeAutospacing="1" w:after="100" w:afterAutospacing="1" w:line="240" w:lineRule="auto"/>
+    </w:pPr>
+    <w:rPr>
+      <w:sz w:val="24"/>
+      <w:szCs w:val="24"/>
+    </w:rPr>
+  </w:style>
 </w:styles>
 </file>
 
@@ -21958,29 +21166,6 @@
 </file>
 
 <file path=customXml/item1.xml><?xml version="1.0" encoding="utf-8"?>
-<?mso-contentType ?>
-<FormTemplates xmlns="http://schemas.microsoft.com/sharepoint/v3/contenttype/forms">
-  <Display>DocumentLibraryForm</Display>
-  <Edit>DocumentLibraryForm</Edit>
-  <New>DocumentLibraryForm</New>
-</FormTemplates>
-</file>
-
-<file path=customXml/item2.xml><?xml version="1.0" encoding="utf-8"?>
-<p:properties xmlns:p="http://schemas.microsoft.com/office/2006/metadata/properties" xmlns:xsi="http://www.w3.org/2001/XMLSchema-instance" xmlns:pc="http://schemas.microsoft.com/office/infopath/2007/PartnerControls">
-  <documentManagement>
-    <SharedWithUsers xmlns="7f0dcb33-685e-48d8-b644-2ef2786c1229">
-      <UserInfo>
-        <DisplayName/>
-        <AccountId xsi:nil="true"/>
-        <AccountType/>
-      </UserInfo>
-    </SharedWithUsers>
-  </documentManagement>
-</p:properties>
-</file>
-
-<file path=customXml/item3.xml><?xml version="1.0" encoding="utf-8"?>
 <ct:contentTypeSchema xmlns:ct="http://schemas.microsoft.com/office/2006/metadata/contentType" xmlns:ma="http://schemas.microsoft.com/office/2006/metadata/properties/metaAttributes" ct:_="" ma:_="" ma:contentTypeName="Document" ma:contentTypeID="0x010100B3483E581E535547A5C5133F57803043" ma:contentTypeVersion="7" ma:contentTypeDescription="Create a new document." ma:contentTypeScope="" ma:versionID="26f0e3c34181377a2b428b97b0aacf58">
   <xsd:schema xmlns:xsd="http://www.w3.org/2001/XMLSchema" xmlns:xs="http://www.w3.org/2001/XMLSchema" xmlns:p="http://schemas.microsoft.com/office/2006/metadata/properties" xmlns:ns2="0a074a96-e172-4849-a42b-0522bc04182b" xmlns:ns3="7f0dcb33-685e-48d8-b644-2ef2786c1229" targetNamespace="http://schemas.microsoft.com/office/2006/metadata/properties" ma:root="true" ma:fieldsID="c6eeec6c9df2cadb2fce64bd00511549" ns2:_="" ns3:_="">
     <xsd:import namespace="0a074a96-e172-4849-a42b-0522bc04182b"/>
@@ -22165,25 +21350,30 @@
 </ct:contentTypeSchema>
 </file>
 
-<file path=customXml/itemProps1.xml><?xml version="1.0" encoding="utf-8"?>
-<ds:datastoreItem xmlns:ds="http://schemas.openxmlformats.org/officeDocument/2006/customXml" ds:itemID="{CEAD825D-2413-46BA-BB1F-DCE637B19B0C}">
-  <ds:schemaRefs>
-    <ds:schemaRef ds:uri="http://schemas.microsoft.com/sharepoint/v3/contenttype/forms"/>
-  </ds:schemaRefs>
-</ds:datastoreItem>
+<file path=customXml/item2.xml><?xml version="1.0" encoding="utf-8"?>
+<p:properties xmlns:p="http://schemas.microsoft.com/office/2006/metadata/properties" xmlns:xsi="http://www.w3.org/2001/XMLSchema-instance" xmlns:pc="http://schemas.microsoft.com/office/infopath/2007/PartnerControls">
+  <documentManagement>
+    <SharedWithUsers xmlns="7f0dcb33-685e-48d8-b644-2ef2786c1229">
+      <UserInfo>
+        <DisplayName/>
+        <AccountId xsi:nil="true"/>
+        <AccountType/>
+      </UserInfo>
+    </SharedWithUsers>
+  </documentManagement>
+</p:properties>
 </file>
 
-<file path=customXml/itemProps2.xml><?xml version="1.0" encoding="utf-8"?>
-<ds:datastoreItem xmlns:ds="http://schemas.openxmlformats.org/officeDocument/2006/customXml" ds:itemID="{E4B4D352-B35B-4B3A-95D2-902933709BD2}">
-  <ds:schemaRefs>
-    <ds:schemaRef ds:uri="http://schemas.microsoft.com/office/2006/metadata/properties"/>
-    <ds:schemaRef ds:uri="http://schemas.microsoft.com/office/infopath/2007/PartnerControls"/>
-    <ds:schemaRef ds:uri="7f0dcb33-685e-48d8-b644-2ef2786c1229"/>
-  </ds:schemaRefs>
-</ds:datastoreItem>
+<file path=customXml/item3.xml><?xml version="1.0" encoding="utf-8"?>
+<?mso-contentType ?>
+<FormTemplates xmlns="http://schemas.microsoft.com/sharepoint/v3/contenttype/forms">
+  <Display>DocumentLibraryForm</Display>
+  <Edit>DocumentLibraryForm</Edit>
+  <New>DocumentLibraryForm</New>
+</FormTemplates>
 </file>
 
-<file path=customXml/itemProps3.xml><?xml version="1.0" encoding="utf-8"?>
+<file path=customXml/itemProps1.xml><?xml version="1.0" encoding="utf-8"?>
 <ds:datastoreItem xmlns:ds="http://schemas.openxmlformats.org/officeDocument/2006/customXml" ds:itemID="{2240CE2F-0274-489A-BA80-8887BFB6B269}">
   <ds:schemaRefs>
     <ds:schemaRef ds:uri="http://schemas.microsoft.com/office/2006/metadata/contentType"/>
@@ -22200,4 +21390,22 @@
     <ds:schemaRef ds:uri="http://schemas.microsoft.com/internal/obd"/>
   </ds:schemaRefs>
 </ds:datastoreItem>
+</file>
+
+<file path=customXml/itemProps2.xml><?xml version="1.0" encoding="utf-8"?>
+<ds:datastoreItem xmlns:ds="http://schemas.openxmlformats.org/officeDocument/2006/customXml" ds:itemID="{E4B4D352-B35B-4B3A-95D2-902933709BD2}">
+  <ds:schemaRefs>
+    <ds:schemaRef ds:uri="http://schemas.microsoft.com/office/2006/metadata/properties"/>
+    <ds:schemaRef ds:uri="http://schemas.microsoft.com/office/infopath/2007/PartnerControls"/>
+    <ds:schemaRef ds:uri="7f0dcb33-685e-48d8-b644-2ef2786c1229"/>
+  </ds:schemaRefs>
+</ds:datastoreItem>
+</file>
+
+<file path=customXml/itemProps3.xml><?xml version="1.0" encoding="utf-8"?>
+<ds:datastoreItem xmlns:ds="http://schemas.openxmlformats.org/officeDocument/2006/customXml" ds:itemID="{CEAD825D-2413-46BA-BB1F-DCE637B19B0C}">
+  <ds:schemaRefs>
+    <ds:schemaRef ds:uri="http://schemas.microsoft.com/sharepoint/v3/contenttype/forms"/>
+  </ds:schemaRefs>
+</ds:datastoreItem>
 </file>
</xml_diff>